<commit_message>
v0.23 complete: paper, charts, content module, OSF deposit, SSRN packet
Co-Authored-By: Claude Opus 4.7 (1M context) <noreply@anthropic.com>
</commit_message>
<xml_diff>
--- a/papers/aias_1_0/jar_submission/declarations.docx
+++ b/papers/aias_1_0/jar_submission/declarations.docx
@@ -1,82 +1,124 @@
 
 <file path=word/document.xml><?xml version="1.0" encoding="utf-8"?>
-<w:document xmlns:w="http://schemas.openxmlformats.org/wordprocessingml/2006/main" xmlns:m="http://schemas.openxmlformats.org/officeDocument/2006/math" xmlns:r="http://schemas.openxmlformats.org/officeDocument/2006/relationships" xmlns:o="urn:schemas-microsoft-com:office:office" xmlns:v="urn:schemas-microsoft-com:vml" xmlns:w10="urn:schemas-microsoft-com:office:word" xmlns:a="http://schemas.openxmlformats.org/drawingml/2006/main" xmlns:pic="http://schemas.openxmlformats.org/drawingml/2006/picture" xmlns:wp="http://schemas.openxmlformats.org/drawingml/2006/wordprocessingDrawing">
+<w:document xmlns:wpc="http://schemas.microsoft.com/office/word/2010/wordprocessingCanvas" xmlns:cx="http://schemas.microsoft.com/office/drawing/2014/chartex" xmlns:cx1="http://schemas.microsoft.com/office/drawing/2015/9/8/chartex" xmlns:cx2="http://schemas.microsoft.com/office/drawing/2015/10/21/chartex" xmlns:cx3="http://schemas.microsoft.com/office/drawing/2016/5/9/chartex" xmlns:cx4="http://schemas.microsoft.com/office/drawing/2016/5/10/chartex" xmlns:cx5="http://schemas.microsoft.com/office/drawing/2016/5/11/chartex" xmlns:cx6="http://schemas.microsoft.com/office/drawing/2016/5/12/chartex" xmlns:cx7="http://schemas.microsoft.com/office/drawing/2016/5/13/chartex" xmlns:cx8="http://schemas.microsoft.com/office/drawing/2016/5/14/chartex" xmlns:mc="http://schemas.openxmlformats.org/markup-compatibility/2006" xmlns:m="http://schemas.openxmlformats.org/officeDocument/2006/math" xmlns:aink="http://schemas.microsoft.com/office/drawing/2016/ink" xmlns:am3d="http://schemas.microsoft.com/office/drawing/2017/model3d" xmlns:oel="http://schemas.microsoft.com/office/2019/extlst" xmlns:r="http://schemas.openxmlformats.org/officeDocument/2006/relationships" xmlns:wp14="http://schemas.microsoft.com/office/word/2010/wordprocessingDrawing" xmlns:wp="http://schemas.openxmlformats.org/drawingml/2006/wordprocessingDrawing" xmlns:wpg="http://schemas.microsoft.com/office/word/2010/wordprocessingGroup" xmlns:wpi="http://schemas.microsoft.com/office/word/2010/wordprocessingInk" xmlns:wps="http://schemas.microsoft.com/office/word/2010/wordprocessingShape" xmlns:o="urn:schemas-microsoft-com:office:office" xmlns:v="urn:schemas-microsoft-com:vml" xmlns:w10="urn:schemas-microsoft-com:office:word" xmlns:w="http://schemas.openxmlformats.org/wordprocessingml/2006/main" xmlns:w14="http://schemas.microsoft.com/office/word/2010/wordml" xmlns:w15="http://schemas.microsoft.com/office/word/2012/wordml" xmlns:w16cex="http://schemas.microsoft.com/office/word/2018/wordml/cex" xmlns:w16cid="http://schemas.microsoft.com/office/word/2016/wordml/cid" xmlns:w16="http://schemas.microsoft.com/office/word/2018/wordml" xmlns:w16sdtdh="http://schemas.microsoft.com/office/word/2020/wordml/sdtdatahash" xmlns:w16sdtfl="http://schemas.microsoft.com/office/word/2024/wordml/sdtformatlock" xmlns:w16se="http://schemas.microsoft.com/office/word/2015/wordml/symex" xmlns:w16du="http://schemas.microsoft.com/office/word/2023/wordml/word16du" xmlns:wne="http://schemas.microsoft.com/office/word/2006/wordml" mc:Ignorable="w14 w15 w16se w16cid w16 w16cex w16sdtdh w16sdtfl w16du wp14">
   <w:body>
     <w:p>
       <w:pPr>
         <w:pStyle w:val="Author"/>
-      </w:pPr>
-      <w:r>
-        <w:t xml:space="preserve">Pablo Ulpiano González Castro</w:t>
-      </w:r>
-    </w:p>
-    <w:bookmarkStart w:id="9" w:name="X3a074c3aa9d7b25cb9ee82e04b301266777a8d0"/>
+        <w:rPr>
+          <w:color w:val="000000" w:themeColor="text1"/>
+        </w:rPr>
+      </w:pPr>
+      <w:r>
+        <w:rPr>
+          <w:color w:val="000000" w:themeColor="text1"/>
+        </w:rPr>
+        <w:t>Pablo Ulpiano González Castro</w:t>
+      </w:r>
+    </w:p>
     <w:p>
       <w:pPr>
         <w:pStyle w:val="Heading1"/>
-      </w:pPr>
-      <w:r>
-        <w:t xml:space="preserve">Declarations — JAR Submission: AIAS 1.0 Synthesis Paper</w:t>
+        <w:rPr>
+          <w:color w:val="000000" w:themeColor="text1"/>
+        </w:rPr>
+      </w:pPr>
+      <w:bookmarkStart w:id="0" w:name="X3a074c3aa9d7b25cb9ee82e04b301266777a8d0"/>
+      <w:r>
+        <w:rPr>
+          <w:color w:val="000000" w:themeColor="text1"/>
+        </w:rPr>
+        <w:t>Declarations — JAR Submission: AIAS 1.0 Synthesis Paper</w:t>
       </w:r>
     </w:p>
     <w:p>
       <w:pPr>
         <w:pStyle w:val="FirstParagraph"/>
+        <w:rPr>
+          <w:color w:val="000000" w:themeColor="text1"/>
+        </w:rPr>
       </w:pPr>
       <w:r>
         <w:rPr>
           <w:b/>
           <w:bCs/>
-        </w:rPr>
-        <w:t xml:space="preserve">Declaration of Interest / Competing Interests</w:t>
+          <w:color w:val="000000" w:themeColor="text1"/>
+        </w:rPr>
+        <w:t>Declaration of Interest / Competing Interests</w:t>
       </w:r>
     </w:p>
     <w:p>
       <w:pPr>
         <w:pStyle w:val="BodyText"/>
-      </w:pPr>
-      <w:r>
-        <w:t xml:space="preserve">The author is employed full-time as Director, Corporate Brand Creative and Governance at Samsung Electronics America. The AIAS Presence Measurement Protocol and the synthesis work reported in this paper are the author’s independent academic research, conducted outside the scope of employment, in the author’s role as faculty at the School of Visual Arts MPS Branding Program (primary academic affiliation) and founder of Third System (independent research entity; data archive and methodology venue). Samsung had no role in the design, execution, analysis, or interpretation of this work. No Samsung products, Samsung-affiliated brands, or Samsung-relevant categories appear as substrates in the measurement program. Each phase in the v0.16–v0.21 corpus included a pre-acquisition COI screen confirming no brand in the phase panel is affiliated with Samsung Electronics America; the synthesis introduces no new panel and inherits the per-phase COI screens as documented at each phase’s OSF deposit (https://osf.io/ec6wh). No other financial or non-financial competing interests are relevant to the present research.</w:t>
+        <w:rPr>
+          <w:color w:val="000000" w:themeColor="text1"/>
+        </w:rPr>
+      </w:pPr>
+      <w:r>
+        <w:rPr>
+          <w:color w:val="000000" w:themeColor="text1"/>
+        </w:rPr>
+        <w:t>The author is employed full-time as Director, Corporate Brand Creative and Governance at Samsung Electronics America. The AIAS Presence Measurement Protocol and the synthesis work reported in this paper are the author’s independent academic research, conducted outside the scope of employment, in the author’s role as faculty at the School of Visual Arts MPS Branding Program (primary academic affiliation) and founder of Third System (independent research entity; data archive and methodology venue). Samsung had no role in the design, execution, analysis, or interpretation of this work. No Samsung products, Samsung-affiliated brands, or Samsung-relevant categories appear as substrates in the measurement program. Each phase in the v0.16–v0.21 corpus included a pre-acquisition COI screen confirming no brand in the phase panel is affiliated with Samsung Electronics America; the synthesis introduces no new panel and inherits the per-phase COI screens as documented at each phase’s OSF deposit (https://osf.io/ec6wh). No other financial or non-financial competing interests are relevant to the present research.</w:t>
       </w:r>
     </w:p>
     <w:p>
       <w:pPr>
         <w:pStyle w:val="BodyText"/>
+        <w:rPr>
+          <w:color w:val="000000" w:themeColor="text1"/>
+        </w:rPr>
       </w:pPr>
       <w:r>
         <w:rPr>
           <w:b/>
           <w:bCs/>
-        </w:rPr>
-        <w:t xml:space="preserve">Funding</w:t>
+          <w:color w:val="000000" w:themeColor="text1"/>
+        </w:rPr>
+        <w:t>Funding</w:t>
       </w:r>
     </w:p>
     <w:p>
       <w:pPr>
         <w:pStyle w:val="BodyText"/>
-      </w:pPr>
-      <w:r>
-        <w:t xml:space="preserve">Self-funded. No external funding sources, grants, or sponsorships.</w:t>
+        <w:rPr>
+          <w:color w:val="000000" w:themeColor="text1"/>
+        </w:rPr>
+      </w:pPr>
+      <w:r>
+        <w:rPr>
+          <w:color w:val="000000" w:themeColor="text1"/>
+        </w:rPr>
+        <w:t>Self-funded. No external funding sources, grants, or sponsorships.</w:t>
       </w:r>
     </w:p>
     <w:p>
       <w:pPr>
         <w:pStyle w:val="BodyText"/>
+        <w:rPr>
+          <w:color w:val="000000" w:themeColor="text1"/>
+        </w:rPr>
       </w:pPr>
       <w:r>
         <w:rPr>
           <w:b/>
           <w:bCs/>
-        </w:rPr>
-        <w:t xml:space="preserve">Data and Code Availability</w:t>
+          <w:color w:val="000000" w:themeColor="text1"/>
+        </w:rPr>
+        <w:t>Data and Code Availability</w:t>
       </w:r>
     </w:p>
     <w:p>
       <w:pPr>
         <w:pStyle w:val="BodyText"/>
-      </w:pPr>
-      <w:r>
-        <w:t xml:space="preserve">All pre-registration artifacts, acquisition data, scoring code, retrospective scoring outputs, cross-phase synthesis data, chart sources, and verdict outputs are deposited under Open Science Framework project ec6wh (https://osf.io/ec6wh). Specific deposits:</w:t>
+        <w:rPr>
+          <w:color w:val="000000" w:themeColor="text1"/>
+        </w:rPr>
+      </w:pPr>
+      <w:r>
+        <w:rPr>
+          <w:color w:val="000000" w:themeColor="text1"/>
+        </w:rPr>
+        <w:t>All pre-registration artifacts, acquisition data, scoring code, retrospective scoring outputs, cross-phase synthesis data, chart sources, and verdict outputs are deposited under Open Science Framework project ec6wh (https://osf.io/ec6wh). Specific deposits:</w:t>
       </w:r>
     </w:p>
     <w:p>
@@ -84,11 +126,17 @@
         <w:pStyle w:val="Compact"/>
         <w:numPr>
           <w:ilvl w:val="0"/>
-          <w:numId w:val="1001"/>
+          <w:numId w:val="2"/>
         </w:numPr>
-      </w:pPr>
-      <w:r>
-        <w:t xml:space="preserve">Synthesis paper: https://osf.io/ec6wh/aias_1_0/</w:t>
+        <w:rPr>
+          <w:color w:val="000000" w:themeColor="text1"/>
+        </w:rPr>
+      </w:pPr>
+      <w:r>
+        <w:rPr>
+          <w:color w:val="000000" w:themeColor="text1"/>
+        </w:rPr>
+        <w:t>Synthesis paper: https://osf.io/ec6wh/aias_1_0/</w:t>
       </w:r>
     </w:p>
     <w:p>
@@ -96,11 +144,17 @@
         <w:pStyle w:val="Compact"/>
         <w:numPr>
           <w:ilvl w:val="0"/>
-          <w:numId w:val="1001"/>
+          <w:numId w:val="2"/>
         </w:numPr>
-      </w:pPr>
-      <w:r>
-        <w:t xml:space="preserve">Phase papers: https://osf.io/ec6wh/v16/ through https://osf.io/ec6wh/v21/</w:t>
+        <w:rPr>
+          <w:color w:val="000000" w:themeColor="text1"/>
+        </w:rPr>
+      </w:pPr>
+      <w:r>
+        <w:rPr>
+          <w:color w:val="000000" w:themeColor="text1"/>
+        </w:rPr>
+        <w:t>Phase papers: https://osf.io/ec6wh/v16/ through https://osf.io/ec6wh/v21/</w:t>
       </w:r>
     </w:p>
     <w:p>
@@ -108,159 +162,203 @@
         <w:pStyle w:val="Compact"/>
         <w:numPr>
           <w:ilvl w:val="0"/>
-          <w:numId w:val="1001"/>
+          <w:numId w:val="2"/>
         </w:numPr>
-      </w:pPr>
-      <w:r>
-        <w:t xml:space="preserve">Methodology papers: https://osf.io/ec6wh/methodology/v1_2/ through https://osf.io/ec6wh/methodology/v1_6/</w:t>
+        <w:rPr>
+          <w:color w:val="000000" w:themeColor="text1"/>
+        </w:rPr>
+      </w:pPr>
+      <w:r>
+        <w:rPr>
+          <w:color w:val="000000" w:themeColor="text1"/>
+        </w:rPr>
+        <w:t>Methodology papers: https://osf.io/ec6wh/methodology/v1_2/ through https://osf.io/ec6wh/methodology/v1_6/</w:t>
       </w:r>
     </w:p>
     <w:p>
       <w:pPr>
         <w:pStyle w:val="FirstParagraph"/>
-      </w:pPr>
-      <w:r>
-        <w:t xml:space="preserve">Each deposit includes the locked pre-registration, raw acquisition data, scoring code, and verdict outputs for the corresponding phase or methodology version.</w:t>
+        <w:rPr>
+          <w:color w:val="000000" w:themeColor="text1"/>
+        </w:rPr>
+      </w:pPr>
+      <w:r>
+        <w:rPr>
+          <w:color w:val="000000" w:themeColor="text1"/>
+        </w:rPr>
+        <w:t>Each deposit includes the locked pre-registration, raw acquisition data, scoring code, and verdict outputs for the corresponding phase or methodology version.</w:t>
       </w:r>
     </w:p>
     <w:p>
       <w:pPr>
         <w:pStyle w:val="BodyText"/>
+        <w:rPr>
+          <w:color w:val="000000" w:themeColor="text1"/>
+        </w:rPr>
       </w:pPr>
       <w:r>
         <w:rPr>
           <w:b/>
           <w:bCs/>
-        </w:rPr>
-        <w:t xml:space="preserve">Ethical Statement</w:t>
+          <w:color w:val="000000" w:themeColor="text1"/>
+        </w:rPr>
+        <w:t>Ethical Statement</w:t>
       </w:r>
     </w:p>
     <w:p>
       <w:pPr>
         <w:pStyle w:val="BodyText"/>
-      </w:pPr>
-      <w:r>
-        <w:t xml:space="preserve">Not applicable. The study did not involve human subjects, animal subjects, or other ethics-board-relevant procedures. All data is generated from publicly accessible LLM API responses to category-anchored prompts under the program’s pre-registered measurement protocol.</w:t>
+        <w:rPr>
+          <w:color w:val="000000" w:themeColor="text1"/>
+        </w:rPr>
+      </w:pPr>
+      <w:r>
+        <w:rPr>
+          <w:color w:val="000000" w:themeColor="text1"/>
+        </w:rPr>
+        <w:t>Not applicable. The study did not involve human subjects, animal subjects, or other ethics-board-relevant procedures. All data is generated from publicly accessible LLM API responses to category-anchored prompts under the program’s pre-registered measurement protocol.</w:t>
       </w:r>
     </w:p>
     <w:p>
       <w:pPr>
         <w:pStyle w:val="BodyText"/>
+        <w:rPr>
+          <w:color w:val="000000" w:themeColor="text1"/>
+        </w:rPr>
       </w:pPr>
       <w:r>
         <w:rPr>
           <w:b/>
           <w:bCs/>
-        </w:rPr>
-        <w:t xml:space="preserve">AI / LLM Disclosure</w:t>
+          <w:color w:val="000000" w:themeColor="text1"/>
+        </w:rPr>
+        <w:lastRenderedPageBreak/>
+        <w:t>AI / LLM Disclosure</w:t>
       </w:r>
     </w:p>
     <w:p>
       <w:pPr>
         <w:pStyle w:val="BodyText"/>
-      </w:pPr>
-      <w:r>
-        <w:t xml:space="preserve">Large language models are the measurement instrument of the study, not the writing instrument. The reference panel of six LLMs (Claude Opus 4.5, Claude Sonnet 4.5, GPT-4o, GPT-4o-mini, Gemini 2.5 Flash, Gemini 2.5 Flash Lite) was queried per the locked measurement protocol at each phase’s acquisition. Manuscript writing was assisted by Claude (Anthropic) as a drafting and editing tool; all substantive intellectual content, methodology design, hypothesis specification, and conclusions are the author’s own. AI-assisted writing is disclosed in alignment with COPE and ICMJE guidance on LLM use in scholarly writing, and with Taylor &amp; Francis editorial policy on generative AI.</w:t>
+        <w:rPr>
+          <w:color w:val="000000" w:themeColor="text1"/>
+        </w:rPr>
+      </w:pPr>
+      <w:r>
+        <w:rPr>
+          <w:color w:val="000000" w:themeColor="text1"/>
+        </w:rPr>
+        <w:t>Large language models are the measurement instrument of the study, not the writing instrument. The reference panel of six LLMs (Claude Opus 4.5, Claude Sonnet 4.5, GPT-4o, GPT-4o-mini, Gemini 2.5 Flash, Gemini 2.5 Flash Lite) was queried per the locked measurement protocol at each phase’s acquisition. Manuscript writing was assisted by Claude (Anthropic) as a drafting and editing tool; all substantive intellectual content, methodology design, hypothesis specification, and conclusions are the author’s own. AI-assisted writing is disclosed in alignment with COPE and ICMJE guidance on LLM use in scholarly writing, and with Taylor &amp; Francis editorial policy on generative AI.</w:t>
       </w:r>
     </w:p>
     <w:p>
       <w:pPr>
         <w:pStyle w:val="BodyText"/>
+        <w:rPr>
+          <w:color w:val="000000" w:themeColor="text1"/>
+        </w:rPr>
       </w:pPr>
       <w:r>
         <w:rPr>
           <w:b/>
           <w:bCs/>
-        </w:rPr>
-        <w:t xml:space="preserve">ORCID</w:t>
+          <w:color w:val="000000" w:themeColor="text1"/>
+        </w:rPr>
+        <w:t>ORCID</w:t>
       </w:r>
     </w:p>
     <w:p>
       <w:pPr>
         <w:pStyle w:val="BodyText"/>
-      </w:pPr>
-      <w:r>
-        <w:t xml:space="preserve">Corresponding author: 0009-0003-8968-9990 (https://orcid.org/0009-0003-8968-9990)</w:t>
+        <w:rPr>
+          <w:color w:val="000000" w:themeColor="text1"/>
+        </w:rPr>
+      </w:pPr>
+      <w:r>
+        <w:rPr>
+          <w:color w:val="000000" w:themeColor="text1"/>
+        </w:rPr>
+        <w:t>Corresponding author: 0009-0003-8968-9990 (https://orcid.org/0009-0003-8968-9990)</w:t>
       </w:r>
     </w:p>
     <w:p>
       <w:pPr>
         <w:pStyle w:val="BodyText"/>
+        <w:rPr>
+          <w:color w:val="000000" w:themeColor="text1"/>
+        </w:rPr>
       </w:pPr>
       <w:r>
         <w:rPr>
           <w:b/>
           <w:bCs/>
-        </w:rPr>
-        <w:t xml:space="preserve">Authorship</w:t>
+          <w:color w:val="000000" w:themeColor="text1"/>
+        </w:rPr>
+        <w:t>Authorship</w:t>
       </w:r>
     </w:p>
     <w:p>
       <w:pPr>
         <w:pStyle w:val="BodyText"/>
-      </w:pPr>
-      <w:r>
-        <w:t xml:space="preserve">Single author: Pablo Ulpiano González Castro. No co-authors, ghost authors, or undisclosed contributors. The author conceived the research program, designed the measurement protocol, conducted all acquisitions, performed all analyses, wrote the manuscript, and approved the final version for submission.</w:t>
+        <w:rPr>
+          <w:color w:val="000000" w:themeColor="text1"/>
+        </w:rPr>
+      </w:pPr>
+      <w:r>
+        <w:rPr>
+          <w:color w:val="000000" w:themeColor="text1"/>
+        </w:rPr>
+        <w:t>Single author: Pablo Ulpiano González Castro. No co-authors, ghost authors, or undisclosed contributors. The author conceived the research program, designed the measurement protocol, conducted all acquisitions, performed all analyses, wrote the manuscript, and approved the final version for submission.</w:t>
       </w:r>
     </w:p>
     <w:p>
       <w:pPr>
         <w:pStyle w:val="BodyText"/>
+        <w:rPr>
+          <w:color w:val="000000" w:themeColor="text1"/>
+        </w:rPr>
       </w:pPr>
       <w:r>
         <w:rPr>
           <w:b/>
           <w:bCs/>
-        </w:rPr>
-        <w:t xml:space="preserve">Trademark Notice</w:t>
+          <w:color w:val="000000" w:themeColor="text1"/>
+        </w:rPr>
+        <w:t>Trademark Notice</w:t>
       </w:r>
     </w:p>
     <w:p>
       <w:pPr>
         <w:pStyle w:val="BodyText"/>
-      </w:pPr>
-      <w:r>
-        <w:t xml:space="preserve">AIAS and Third System are trademarks of the research program. Trademark registration status: common-law use; no federal registration.</w:t>
-      </w:r>
-    </w:p>
-    <w:bookmarkEnd w:id="9"/>
+        <w:rPr>
+          <w:color w:val="000000" w:themeColor="text1"/>
+        </w:rPr>
+      </w:pPr>
+      <w:r>
+        <w:rPr>
+          <w:color w:val="000000" w:themeColor="text1"/>
+        </w:rPr>
+        <w:t>AIAS and Third System are trademarks of the research program. Trademark registration status: common-law use; no federal registration.</w:t>
+      </w:r>
+      <w:bookmarkEnd w:id="0"/>
+    </w:p>
     <w:sectPr>
       <w:footnotePr>
         <w:numRestart w:val="eachSect"/>
       </w:footnotePr>
+      <w:pgSz w:w="12240" w:h="15840"/>
+      <w:pgMar w:top="1440" w:right="1440" w:bottom="1440" w:left="1440" w:header="720" w:footer="720" w:gutter="0"/>
+      <w:cols w:space="720"/>
     </w:sectPr>
   </w:body>
 </w:document>
 </file>
 
-<file path=word/comments.xml><?xml version="1.0" encoding="utf-8"?>
-<w:comments xmlns:w="http://schemas.openxmlformats.org/wordprocessingml/2006/main" xmlns:m="http://schemas.openxmlformats.org/officeDocument/2006/math" xmlns:r="http://schemas.openxmlformats.org/officeDocument/2006/relationships" xmlns:o="urn:schemas-microsoft-com:office:office" xmlns:v="urn:schemas-microsoft-com:vml" xmlns:w10="urn:schemas-microsoft-com:office:word" xmlns:a="http://schemas.openxmlformats.org/drawingml/2006/main" xmlns:pic="http://schemas.openxmlformats.org/drawingml/2006/picture" xmlns:wp="http://schemas.openxmlformats.org/drawingml/2006/wordprocessingDrawing"/>
-</file>
-
-<file path=word/footnotes.xml><?xml version="1.0" encoding="utf-8"?>
-<w:footnotes xmlns:w="http://schemas.openxmlformats.org/wordprocessingml/2006/main" xmlns:m="http://schemas.openxmlformats.org/officeDocument/2006/math" xmlns:r="http://schemas.openxmlformats.org/officeDocument/2006/relationships" xmlns:o="urn:schemas-microsoft-com:office:office" xmlns:v="urn:schemas-microsoft-com:vml" xmlns:w10="urn:schemas-microsoft-com:office:word" xmlns:a="http://schemas.openxmlformats.org/drawingml/2006/main" xmlns:pic="http://schemas.openxmlformats.org/drawingml/2006/picture" xmlns:wp="http://schemas.openxmlformats.org/drawingml/2006/wordprocessingDrawing">
-  <w:footnote w:type="continuationSeparator" w:id="0">
-    <w:p>
-      <w:r>
-        <w:continuationSeparator/>
-      </w:r>
-    </w:p>
-  </w:footnote>
-  <w:footnote w:type="separator" w:id="-1">
-    <w:p>
-      <w:r>
-        <w:separator/>
-      </w:r>
-    </w:p>
-  </w:footnote>
-</w:footnotes>
-</file>
-
 <file path=word/numbering.xml><?xml version="1.0" encoding="utf-8"?>
-<w:numbering xmlns:w="http://schemas.openxmlformats.org/wordprocessingml/2006/main">
-  <w:abstractNum w:abstractNumId="990">
+<w:numbering xmlns:wpc="http://schemas.microsoft.com/office/word/2010/wordprocessingCanvas" xmlns:cx="http://schemas.microsoft.com/office/drawing/2014/chartex" xmlns:cx1="http://schemas.microsoft.com/office/drawing/2015/9/8/chartex" xmlns:cx2="http://schemas.microsoft.com/office/drawing/2015/10/21/chartex" xmlns:cx3="http://schemas.microsoft.com/office/drawing/2016/5/9/chartex" xmlns:cx4="http://schemas.microsoft.com/office/drawing/2016/5/10/chartex" xmlns:cx5="http://schemas.microsoft.com/office/drawing/2016/5/11/chartex" xmlns:cx6="http://schemas.microsoft.com/office/drawing/2016/5/12/chartex" xmlns:cx7="http://schemas.microsoft.com/office/drawing/2016/5/13/chartex" xmlns:cx8="http://schemas.microsoft.com/office/drawing/2016/5/14/chartex" xmlns:mc="http://schemas.openxmlformats.org/markup-compatibility/2006" xmlns:m="http://schemas.openxmlformats.org/officeDocument/2006/math" xmlns:aink="http://schemas.microsoft.com/office/drawing/2016/ink" xmlns:am3d="http://schemas.microsoft.com/office/drawing/2017/model3d" xmlns:oel="http://schemas.microsoft.com/office/2019/extlst" xmlns:r="http://schemas.openxmlformats.org/officeDocument/2006/relationships" xmlns:wp14="http://schemas.microsoft.com/office/word/2010/wordprocessingDrawing" xmlns:wp="http://schemas.openxmlformats.org/drawingml/2006/wordprocessingDrawing" xmlns:wpg="http://schemas.microsoft.com/office/word/2010/wordprocessingGroup" xmlns:wpi="http://schemas.microsoft.com/office/word/2010/wordprocessingInk" xmlns:wps="http://schemas.microsoft.com/office/word/2010/wordprocessingShape" xmlns:o="urn:schemas-microsoft-com:office:office" xmlns:v="urn:schemas-microsoft-com:vml" xmlns:w10="urn:schemas-microsoft-com:office:word" xmlns:w="http://schemas.openxmlformats.org/wordprocessingml/2006/main" xmlns:w14="http://schemas.microsoft.com/office/word/2010/wordml" xmlns:w15="http://schemas.microsoft.com/office/word/2012/wordml" xmlns:w16cex="http://schemas.microsoft.com/office/word/2018/wordml/cex" xmlns:w16cid="http://schemas.microsoft.com/office/word/2016/wordml/cid" xmlns:w16="http://schemas.microsoft.com/office/word/2018/wordml" xmlns:w16sdtdh="http://schemas.microsoft.com/office/word/2020/wordml/sdtdatahash" xmlns:w16sdtfl="http://schemas.microsoft.com/office/word/2024/wordml/sdtformatlock" xmlns:w16se="http://schemas.microsoft.com/office/word/2015/wordml/symex" xmlns:w16du="http://schemas.microsoft.com/office/word/2023/wordml/word16du" xmlns:wne="http://schemas.microsoft.com/office/word/2006/wordml" mc:Ignorable="w14 w15 w16se w16cid w16 w16cex w16sdtdh w16sdtfl w16du wp14">
+  <w:abstractNum w:abstractNumId="0" w15:restartNumberingAfterBreak="0">
     <w:nsid w:val="0000A990"/>
     <w:multiLevelType w:val="multilevel"/>
+    <w:tmpl w:val="2760FF08"/>
     <w:lvl w:ilvl="0">
       <w:numFmt w:val="bullet"/>
       <w:lvlText w:val=" "/>
@@ -334,9 +432,10 @@
       </w:pPr>
     </w:lvl>
   </w:abstractNum>
-  <w:abstractNum w:abstractNumId="991">
+  <w:abstractNum w:abstractNumId="1" w15:restartNumberingAfterBreak="0">
     <w:nsid w:val="0000A991"/>
     <w:multiLevelType w:val="multilevel"/>
+    <w:tmpl w:val="D59AEB6E"/>
     <w:lvl w:ilvl="0">
       <w:numFmt w:val="bullet"/>
       <w:lvlText w:val=""/>
@@ -437,24 +536,24 @@
       </w:rPr>
     </w:lvl>
   </w:abstractNum>
-  <w:num w:numId="1000">
-    <w:abstractNumId w:val="990"/>
+  <w:num w:numId="1" w16cid:durableId="510024290">
+    <w:abstractNumId w:val="0"/>
   </w:num>
-  <w:num w:numId="1001">
-    <w:abstractNumId w:val="991"/>
+  <w:num w:numId="2" w16cid:durableId="295181256">
+    <w:abstractNumId w:val="1"/>
   </w:num>
 </w:numbering>
 </file>
 
 <file path=word/styles.xml><?xml version="1.0" encoding="utf-8"?>
-<w:styles xmlns:r="http://schemas.openxmlformats.org/officeDocument/2006/relationships" xmlns:w="http://schemas.openxmlformats.org/wordprocessingml/2006/main">
+<w:styles xmlns:mc="http://schemas.openxmlformats.org/markup-compatibility/2006" xmlns:r="http://schemas.openxmlformats.org/officeDocument/2006/relationships" xmlns:w="http://schemas.openxmlformats.org/wordprocessingml/2006/main" xmlns:w14="http://schemas.microsoft.com/office/word/2010/wordml" xmlns:w15="http://schemas.microsoft.com/office/word/2012/wordml" xmlns:w16cex="http://schemas.microsoft.com/office/word/2018/wordml/cex" xmlns:w16cid="http://schemas.microsoft.com/office/word/2016/wordml/cid" xmlns:w16="http://schemas.microsoft.com/office/word/2018/wordml" xmlns:w16sdtdh="http://schemas.microsoft.com/office/word/2020/wordml/sdtdatahash" xmlns:w16sdtfl="http://schemas.microsoft.com/office/word/2024/wordml/sdtformatlock" xmlns:w16se="http://schemas.microsoft.com/office/word/2015/wordml/symex" xmlns:w16du="http://schemas.microsoft.com/office/word/2023/wordml/word16du" mc:Ignorable="w14 w15 w16se w16cid w16 w16cex w16sdtdh w16sdtfl w16du">
   <w:docDefaults>
     <w:rPrDefault>
       <w:rPr>
-        <w:rFonts w:asciiTheme="minorHAnsi" w:cstheme="minorBidi" w:eastAsiaTheme="minorEastAsia" w:hAnsiTheme="minorHAnsi"/>
+        <w:rFonts w:asciiTheme="minorHAnsi" w:eastAsiaTheme="minorEastAsia" w:hAnsiTheme="minorHAnsi" w:cstheme="minorBidi"/>
         <w:sz w:val="24"/>
         <w:szCs w:val="24"/>
-        <w:lang w:bidi="ar-SA" w:eastAsia="zh-CN" w:val="en-US"/>
+        <w:lang w:val="en-US" w:eastAsia="zh-CN" w:bidi="ar-SA"/>
       </w:rPr>
     </w:rPrDefault>
     <w:pPrDefault>
@@ -463,168 +562,255 @@
       </w:pPr>
     </w:pPrDefault>
   </w:docDefaults>
-  <w:latentStyles w:count="276" w:defLockedState="0" w:defQFormat="0" w:defSemiHidden="0" w:defUIPriority="0" w:defUnhideWhenUsed="0"/>
-  <w:style w:default="1" w:styleId="Normal" w:type="paragraph">
+  <w:latentStyles w:defLockedState="0" w:defUIPriority="0" w:defSemiHidden="0" w:defUnhideWhenUsed="0" w:defQFormat="0" w:count="376">
+    <w:lsdException w:name="Normal Table" w:semiHidden="1" w:unhideWhenUsed="1"/>
+    <w:lsdException w:name="Table Simple 1" w:semiHidden="1" w:unhideWhenUsed="1"/>
+    <w:lsdException w:name="Table Simple 2" w:semiHidden="1" w:unhideWhenUsed="1"/>
+    <w:lsdException w:name="Table Simple 3" w:semiHidden="1" w:unhideWhenUsed="1"/>
+    <w:lsdException w:name="Table Classic 1" w:semiHidden="1" w:unhideWhenUsed="1"/>
+    <w:lsdException w:name="Table Classic 2" w:semiHidden="1" w:unhideWhenUsed="1"/>
+    <w:lsdException w:name="Table Classic 3" w:semiHidden="1" w:unhideWhenUsed="1"/>
+    <w:lsdException w:name="Table Classic 4" w:semiHidden="1" w:unhideWhenUsed="1"/>
+    <w:lsdException w:name="Table Colorful 1" w:semiHidden="1" w:unhideWhenUsed="1"/>
+    <w:lsdException w:name="Table Colorful 2" w:semiHidden="1" w:unhideWhenUsed="1"/>
+    <w:lsdException w:name="Table Colorful 3" w:semiHidden="1" w:unhideWhenUsed="1"/>
+    <w:lsdException w:name="Table Columns 1" w:semiHidden="1" w:unhideWhenUsed="1"/>
+    <w:lsdException w:name="Table Columns 2" w:semiHidden="1" w:unhideWhenUsed="1"/>
+    <w:lsdException w:name="Table Columns 3" w:semiHidden="1" w:unhideWhenUsed="1"/>
+    <w:lsdException w:name="Table Columns 4" w:semiHidden="1" w:unhideWhenUsed="1"/>
+    <w:lsdException w:name="Table Columns 5" w:semiHidden="1" w:unhideWhenUsed="1"/>
+    <w:lsdException w:name="Table Grid 1" w:semiHidden="1" w:unhideWhenUsed="1"/>
+    <w:lsdException w:name="Table Grid 2" w:semiHidden="1" w:unhideWhenUsed="1"/>
+    <w:lsdException w:name="Table Grid 3" w:semiHidden="1" w:unhideWhenUsed="1"/>
+    <w:lsdException w:name="Table Grid 4" w:semiHidden="1" w:unhideWhenUsed="1"/>
+    <w:lsdException w:name="Table Grid 5" w:semiHidden="1" w:unhideWhenUsed="1"/>
+    <w:lsdException w:name="Table Grid 6" w:semiHidden="1" w:unhideWhenUsed="1"/>
+    <w:lsdException w:name="Table Grid 7" w:semiHidden="1" w:unhideWhenUsed="1"/>
+    <w:lsdException w:name="Table Grid 8" w:semiHidden="1" w:unhideWhenUsed="1"/>
+    <w:lsdException w:name="Table List 1" w:semiHidden="1" w:unhideWhenUsed="1"/>
+    <w:lsdException w:name="Table List 2" w:semiHidden="1" w:unhideWhenUsed="1"/>
+    <w:lsdException w:name="Table List 3" w:semiHidden="1" w:unhideWhenUsed="1"/>
+    <w:lsdException w:name="Table List 4" w:semiHidden="1" w:unhideWhenUsed="1"/>
+    <w:lsdException w:name="Table List 5" w:semiHidden="1" w:unhideWhenUsed="1"/>
+    <w:lsdException w:name="Table List 6" w:semiHidden="1" w:unhideWhenUsed="1"/>
+    <w:lsdException w:name="Table List 7" w:semiHidden="1" w:unhideWhenUsed="1"/>
+    <w:lsdException w:name="Table List 8" w:semiHidden="1" w:unhideWhenUsed="1"/>
+    <w:lsdException w:name="Table 3D effects 1" w:semiHidden="1" w:unhideWhenUsed="1"/>
+    <w:lsdException w:name="Table 3D effects 2" w:semiHidden="1" w:unhideWhenUsed="1"/>
+    <w:lsdException w:name="Table 3D effects 3" w:semiHidden="1" w:unhideWhenUsed="1"/>
+    <w:lsdException w:name="Table Contemporary" w:semiHidden="1" w:unhideWhenUsed="1"/>
+    <w:lsdException w:name="Table Elegant" w:semiHidden="1" w:unhideWhenUsed="1"/>
+    <w:lsdException w:name="Table Professional" w:semiHidden="1" w:unhideWhenUsed="1"/>
+    <w:lsdException w:name="Table Subtle 1" w:semiHidden="1" w:unhideWhenUsed="1"/>
+    <w:lsdException w:name="Table Subtle 2" w:semiHidden="1" w:unhideWhenUsed="1"/>
+    <w:lsdException w:name="Table Web 1" w:semiHidden="1" w:unhideWhenUsed="1"/>
+    <w:lsdException w:name="Table Web 2" w:semiHidden="1" w:unhideWhenUsed="1"/>
+    <w:lsdException w:name="Table Web 3" w:semiHidden="1" w:unhideWhenUsed="1"/>
+    <w:lsdException w:name="Table Theme" w:semiHidden="1" w:unhideWhenUsed="1"/>
+    <w:lsdException w:name="Light Shading"/>
+    <w:lsdException w:name="Light List"/>
+    <w:lsdException w:name="Light Grid"/>
+    <w:lsdException w:name="Medium Shading 1"/>
+    <w:lsdException w:name="Medium Shading 2"/>
+    <w:lsdException w:name="Medium List 1"/>
+    <w:lsdException w:name="Medium List 2"/>
+    <w:lsdException w:name="Medium Grid 1"/>
+    <w:lsdException w:name="Medium Grid 2"/>
+    <w:lsdException w:name="Medium Grid 3"/>
+    <w:lsdException w:name="Dark List"/>
+    <w:lsdException w:name="Colorful Shading"/>
+    <w:lsdException w:name="Colorful List"/>
+    <w:lsdException w:name="Colorful Grid"/>
+    <w:lsdException w:name="Light Shading Accent 1"/>
+    <w:lsdException w:name="Light List Accent 1"/>
+    <w:lsdException w:name="Light Grid Accent 1"/>
+    <w:lsdException w:name="Medium Shading 1 Accent 1"/>
+    <w:lsdException w:name="Medium Shading 2 Accent 1"/>
+    <w:lsdException w:name="Medium List 1 Accent 1"/>
+    <w:lsdException w:name="Medium List 2 Accent 1"/>
+    <w:lsdException w:name="Medium Grid 1 Accent 1"/>
+    <w:lsdException w:name="Medium Grid 2 Accent 1"/>
+    <w:lsdException w:name="Medium Grid 3 Accent 1"/>
+    <w:lsdException w:name="Dark List Accent 1"/>
+    <w:lsdException w:name="Colorful Shading Accent 1"/>
+    <w:lsdException w:name="Colorful List Accent 1"/>
+    <w:lsdException w:name="Colorful Grid Accent 1"/>
+    <w:lsdException w:name="Light Shading Accent 2"/>
+    <w:lsdException w:name="Light List Accent 2"/>
+    <w:lsdException w:name="Light Grid Accent 2"/>
+    <w:lsdException w:name="Medium Shading 1 Accent 2"/>
+    <w:lsdException w:name="Medium Shading 2 Accent 2"/>
+    <w:lsdException w:name="Medium List 1 Accent 2"/>
+    <w:lsdException w:name="Medium List 2 Accent 2"/>
+    <w:lsdException w:name="Medium Grid 1 Accent 2"/>
+    <w:lsdException w:name="Medium Grid 2 Accent 2"/>
+    <w:lsdException w:name="Medium Grid 3 Accent 2"/>
+    <w:lsdException w:name="Dark List Accent 2"/>
+    <w:lsdException w:name="Colorful Shading Accent 2"/>
+    <w:lsdException w:name="Colorful List Accent 2"/>
+    <w:lsdException w:name="Colorful Grid Accent 2"/>
+    <w:lsdException w:name="Light Shading Accent 3"/>
+    <w:lsdException w:name="Light List Accent 3"/>
+    <w:lsdException w:name="Light Grid Accent 3"/>
+    <w:lsdException w:name="Medium Shading 1 Accent 3"/>
+    <w:lsdException w:name="Medium Shading 2 Accent 3"/>
+    <w:lsdException w:name="Medium List 1 Accent 3"/>
+    <w:lsdException w:name="Medium List 2 Accent 3"/>
+    <w:lsdException w:name="Medium Grid 1 Accent 3"/>
+    <w:lsdException w:name="Medium Grid 2 Accent 3"/>
+    <w:lsdException w:name="Medium Grid 3 Accent 3"/>
+    <w:lsdException w:name="Dark List Accent 3"/>
+    <w:lsdException w:name="Colorful Shading Accent 3"/>
+    <w:lsdException w:name="Colorful List Accent 3"/>
+    <w:lsdException w:name="Colorful Grid Accent 3"/>
+    <w:lsdException w:name="Light Shading Accent 4"/>
+    <w:lsdException w:name="Light List Accent 4"/>
+    <w:lsdException w:name="Light Grid Accent 4"/>
+    <w:lsdException w:name="Medium Shading 1 Accent 4"/>
+    <w:lsdException w:name="Medium Shading 2 Accent 4"/>
+    <w:lsdException w:name="Medium List 1 Accent 4"/>
+    <w:lsdException w:name="Medium List 2 Accent 4"/>
+    <w:lsdException w:name="Medium Grid 1 Accent 4"/>
+    <w:lsdException w:name="Medium Grid 2 Accent 4"/>
+    <w:lsdException w:name="Medium Grid 3 Accent 4"/>
+    <w:lsdException w:name="Dark List Accent 4"/>
+    <w:lsdException w:name="Colorful Shading Accent 4"/>
+    <w:lsdException w:name="Colorful List Accent 4"/>
+    <w:lsdException w:name="Colorful Grid Accent 4"/>
+    <w:lsdException w:name="Light Shading Accent 5"/>
+    <w:lsdException w:name="Light List Accent 5"/>
+    <w:lsdException w:name="Light Grid Accent 5"/>
+    <w:lsdException w:name="Medium Shading 1 Accent 5"/>
+    <w:lsdException w:name="Medium Shading 2 Accent 5"/>
+    <w:lsdException w:name="Medium List 1 Accent 5"/>
+    <w:lsdException w:name="Medium List 2 Accent 5"/>
+    <w:lsdException w:name="Medium Grid 1 Accent 5"/>
+    <w:lsdException w:name="Medium Grid 2 Accent 5"/>
+    <w:lsdException w:name="Medium Grid 3 Accent 5"/>
+    <w:lsdException w:name="Dark List Accent 5"/>
+    <w:lsdException w:name="Colorful Shading Accent 5"/>
+    <w:lsdException w:name="Colorful List Accent 5"/>
+    <w:lsdException w:name="Colorful Grid Accent 5"/>
+    <w:lsdException w:name="Light Shading Accent 6"/>
+    <w:lsdException w:name="Light List Accent 6"/>
+    <w:lsdException w:name="Light Grid Accent 6"/>
+    <w:lsdException w:name="Medium Shading 1 Accent 6"/>
+    <w:lsdException w:name="Medium Shading 2 Accent 6"/>
+    <w:lsdException w:name="Medium List 1 Accent 6"/>
+    <w:lsdException w:name="Medium List 2 Accent 6"/>
+    <w:lsdException w:name="Medium Grid 1 Accent 6"/>
+    <w:lsdException w:name="Medium Grid 2 Accent 6"/>
+    <w:lsdException w:name="Medium Grid 3 Accent 6"/>
+    <w:lsdException w:name="Dark List Accent 6"/>
+    <w:lsdException w:name="Colorful Shading Accent 6"/>
+    <w:lsdException w:name="Colorful List Accent 6"/>
+    <w:lsdException w:name="Colorful Grid Accent 6"/>
+    <w:lsdException w:name="Grid Table 4" w:uiPriority="49"/>
+    <w:lsdException w:name="Grid Table 5 Dark" w:uiPriority="50"/>
+    <w:lsdException w:name="Grid Table 6 Colorful" w:uiPriority="51"/>
+    <w:lsdException w:name="Grid Table 7 Colorful" w:uiPriority="52"/>
+    <w:lsdException w:name="Grid Table 1 Light Accent 1" w:uiPriority="46"/>
+    <w:lsdException w:name="Grid Table 2 Accent 1" w:uiPriority="47"/>
+    <w:lsdException w:name="Grid Table 3 Accent 1" w:uiPriority="48"/>
+    <w:lsdException w:name="Grid Table 4 Accent 1" w:uiPriority="49"/>
+    <w:lsdException w:name="Grid Table 5 Dark Accent 1" w:uiPriority="50"/>
+    <w:lsdException w:name="Grid Table 6 Colorful Accent 1" w:uiPriority="51"/>
+    <w:lsdException w:name="Grid Table 7 Colorful Accent 1" w:uiPriority="52"/>
+    <w:lsdException w:name="Grid Table 1 Light Accent 2" w:uiPriority="46"/>
+    <w:lsdException w:name="Grid Table 2 Accent 2" w:uiPriority="47"/>
+    <w:lsdException w:name="Grid Table 3 Accent 2" w:uiPriority="48"/>
+    <w:lsdException w:name="Grid Table 4 Accent 2" w:uiPriority="49"/>
+    <w:lsdException w:name="Grid Table 5 Dark Accent 2" w:uiPriority="50"/>
+    <w:lsdException w:name="Grid Table 6 Colorful Accent 2" w:uiPriority="51"/>
+    <w:lsdException w:name="Grid Table 7 Colorful Accent 2" w:uiPriority="52"/>
+    <w:lsdException w:name="Grid Table 1 Light Accent 3" w:uiPriority="46"/>
+    <w:lsdException w:name="Grid Table 2 Accent 3" w:uiPriority="47"/>
+    <w:lsdException w:name="Grid Table 3 Accent 3" w:uiPriority="48"/>
+    <w:lsdException w:name="Grid Table 4 Accent 3" w:uiPriority="49"/>
+    <w:lsdException w:name="Grid Table 5 Dark Accent 3" w:uiPriority="50"/>
+    <w:lsdException w:name="Grid Table 6 Colorful Accent 3" w:uiPriority="51"/>
+    <w:lsdException w:name="Grid Table 7 Colorful Accent 3" w:uiPriority="52"/>
+    <w:lsdException w:name="Grid Table 1 Light Accent 4" w:uiPriority="46"/>
+    <w:lsdException w:name="Grid Table 2 Accent 4" w:uiPriority="47"/>
+    <w:lsdException w:name="Grid Table 3 Accent 4" w:uiPriority="48"/>
+    <w:lsdException w:name="Grid Table 4 Accent 4" w:uiPriority="49"/>
+    <w:lsdException w:name="Grid Table 5 Dark Accent 4" w:uiPriority="50"/>
+    <w:lsdException w:name="Grid Table 6 Colorful Accent 4" w:uiPriority="51"/>
+    <w:lsdException w:name="Grid Table 7 Colorful Accent 4" w:uiPriority="52"/>
+    <w:lsdException w:name="Grid Table 1 Light Accent 5" w:uiPriority="46"/>
+    <w:lsdException w:name="Grid Table 2 Accent 5" w:uiPriority="47"/>
+    <w:lsdException w:name="Grid Table 3 Accent 5" w:uiPriority="48"/>
+    <w:lsdException w:name="Grid Table 4 Accent 5" w:uiPriority="49"/>
+    <w:lsdException w:name="Grid Table 5 Dark Accent 5" w:uiPriority="50"/>
+    <w:lsdException w:name="Grid Table 6 Colorful Accent 5" w:uiPriority="51"/>
+    <w:lsdException w:name="Grid Table 7 Colorful Accent 5" w:uiPriority="52"/>
+    <w:lsdException w:name="Grid Table 1 Light Accent 6" w:uiPriority="46"/>
+    <w:lsdException w:name="Grid Table 2 Accent 6" w:uiPriority="47"/>
+    <w:lsdException w:name="Grid Table 3 Accent 6" w:uiPriority="48"/>
+    <w:lsdException w:name="Grid Table 4 Accent 6" w:uiPriority="49"/>
+    <w:lsdException w:name="Grid Table 5 Dark Accent 6" w:uiPriority="50"/>
+    <w:lsdException w:name="Grid Table 6 Colorful Accent 6" w:uiPriority="51"/>
+    <w:lsdException w:name="Grid Table 7 Colorful Accent 6" w:uiPriority="52"/>
+    <w:lsdException w:name="List Table 1 Light" w:uiPriority="46"/>
+    <w:lsdException w:name="List Table 2" w:uiPriority="47"/>
+    <w:lsdException w:name="List Table 3" w:uiPriority="48"/>
+    <w:lsdException w:name="List Table 4" w:uiPriority="49"/>
+    <w:lsdException w:name="List Table 5 Dark" w:uiPriority="50"/>
+    <w:lsdException w:name="List Table 6 Colorful" w:uiPriority="51"/>
+    <w:lsdException w:name="List Table 7 Colorful" w:uiPriority="52"/>
+    <w:lsdException w:name="List Table 1 Light Accent 1" w:uiPriority="46"/>
+    <w:lsdException w:name="List Table 2 Accent 1" w:uiPriority="47"/>
+    <w:lsdException w:name="List Table 3 Accent 1" w:uiPriority="48"/>
+    <w:lsdException w:name="List Table 4 Accent 1" w:uiPriority="49"/>
+    <w:lsdException w:name="List Table 5 Dark Accent 1" w:uiPriority="50"/>
+    <w:lsdException w:name="List Table 6 Colorful Accent 1" w:uiPriority="51"/>
+    <w:lsdException w:name="List Table 7 Colorful Accent 1" w:uiPriority="52"/>
+    <w:lsdException w:name="List Table 1 Light Accent 2" w:uiPriority="46"/>
+    <w:lsdException w:name="List Table 2 Accent 2" w:uiPriority="47"/>
+    <w:lsdException w:name="List Table 3 Accent 2" w:uiPriority="48"/>
+    <w:lsdException w:name="List Table 4 Accent 2" w:uiPriority="49"/>
+    <w:lsdException w:name="List Table 5 Dark Accent 2" w:uiPriority="50"/>
+    <w:lsdException w:name="List Table 6 Colorful Accent 2" w:uiPriority="51"/>
+    <w:lsdException w:name="List Table 7 Colorful Accent 2" w:uiPriority="52"/>
+    <w:lsdException w:name="List Table 1 Light Accent 3" w:uiPriority="46"/>
+    <w:lsdException w:name="List Table 2 Accent 3" w:uiPriority="47"/>
+    <w:lsdException w:name="List Table 3 Accent 3" w:uiPriority="48"/>
+    <w:lsdException w:name="List Table 4 Accent 3" w:uiPriority="49"/>
+    <w:lsdException w:name="List Table 5 Dark Accent 3" w:uiPriority="50"/>
+    <w:lsdException w:name="List Table 6 Colorful Accent 3" w:uiPriority="51"/>
+    <w:lsdException w:name="List Table 7 Colorful Accent 3" w:uiPriority="52"/>
+    <w:lsdException w:name="List Table 1 Light Accent 4" w:uiPriority="46"/>
+    <w:lsdException w:name="List Table 2 Accent 4" w:uiPriority="47"/>
+    <w:lsdException w:name="List Table 3 Accent 4" w:uiPriority="48"/>
+    <w:lsdException w:name="List Table 4 Accent 4" w:uiPriority="49"/>
+    <w:lsdException w:name="List Table 5 Dark Accent 4" w:uiPriority="50"/>
+    <w:lsdException w:name="List Table 6 Colorful Accent 4" w:uiPriority="51"/>
+    <w:lsdException w:name="List Table 7 Colorful Accent 4" w:uiPriority="52"/>
+    <w:lsdException w:name="List Table 1 Light Accent 5" w:uiPriority="46"/>
+    <w:lsdException w:name="List Table 2 Accent 5" w:uiPriority="47"/>
+    <w:lsdException w:name="List Table 3 Accent 5" w:uiPriority="48"/>
+    <w:lsdException w:name="List Table 4 Accent 5" w:uiPriority="49"/>
+    <w:lsdException w:name="List Table 5 Dark Accent 5" w:uiPriority="50"/>
+    <w:lsdException w:name="List Table 6 Colorful Accent 5" w:uiPriority="51"/>
+    <w:lsdException w:name="List Table 7 Colorful Accent 5" w:uiPriority="52"/>
+    <w:lsdException w:name="List Table 1 Light Accent 6" w:uiPriority="46"/>
+    <w:lsdException w:name="List Table 2 Accent 6" w:uiPriority="47"/>
+    <w:lsdException w:name="List Table 3 Accent 6" w:uiPriority="48"/>
+    <w:lsdException w:name="List Table 4 Accent 6" w:uiPriority="49"/>
+    <w:lsdException w:name="List Table 5 Dark Accent 6" w:uiPriority="50"/>
+    <w:lsdException w:name="List Table 6 Colorful Accent 6" w:uiPriority="51"/>
+    <w:lsdException w:name="List Table 7 Colorful Accent 6" w:uiPriority="52"/>
+    <w:lsdException w:name="Mention" w:semiHidden="1" w:uiPriority="99" w:unhideWhenUsed="1"/>
+    <w:lsdException w:name="Smart Hyperlink" w:semiHidden="1" w:uiPriority="99" w:unhideWhenUsed="1"/>
+    <w:lsdException w:name="Hashtag" w:semiHidden="1" w:uiPriority="99" w:unhideWhenUsed="1"/>
+    <w:lsdException w:name="Unresolved Mention" w:semiHidden="1" w:uiPriority="99" w:unhideWhenUsed="1"/>
+    <w:lsdException w:name="Smart Link" w:semiHidden="1" w:uiPriority="99" w:unhideWhenUsed="1"/>
+  </w:latentStyles>
+  <w:style w:type="paragraph" w:default="1" w:styleId="Normal">
     <w:name w:val="Normal"/>
     <w:qFormat/>
   </w:style>
-  <w:style w:styleId="BodyText" w:type="paragraph">
-    <w:name w:val="Body Text"/>
-    <w:basedOn w:val="Normal"/>
-    <w:link w:val="BodyTextChar"/>
-    <w:qFormat/>
-    <w:pPr>
-      <w:spacing w:after="180" w:before="180"/>
-    </w:pPr>
-  </w:style>
-  <w:style w:customStyle="1" w:styleId="FirstParagraph" w:type="paragraph">
-    <w:name w:val="First Paragraph"/>
-    <w:basedOn w:val="BodyText"/>
-    <w:next w:val="BodyText"/>
-    <w:qFormat/>
-  </w:style>
-  <w:style w:customStyle="1" w:styleId="Compact" w:type="paragraph">
-    <w:name w:val="Compact"/>
-    <w:basedOn w:val="BodyText"/>
-    <w:qFormat/>
-    <w:pPr>
-      <w:spacing w:after="36" w:before="36"/>
-    </w:pPr>
-  </w:style>
-  <w:style w:styleId="Title" w:type="paragraph">
-    <w:name w:val="Title"/>
-    <w:basedOn w:val="Normal"/>
-    <w:next w:val="BodyText"/>
-    <w:link w:val="TitleChar"/>
-    <w:uiPriority w:val="10"/>
-    <w:qFormat/>
-    <w:rsid w:val="00A10FD9"/>
-    <w:pPr>
-      <w:spacing w:after="80" w:line="240" w:lineRule="auto"/>
-      <w:contextualSpacing/>
-      <w:jc w:val="center"/>
-    </w:pPr>
-    <w:rPr>
-      <w:rFonts w:asciiTheme="majorHAnsi" w:cstheme="majorBidi" w:eastAsiaTheme="majorEastAsia" w:hAnsiTheme="majorHAnsi"/>
-      <w:sz w:val="56"/>
-      <w:szCs w:val="56"/>
-    </w:rPr>
-  </w:style>
-  <w:style w:customStyle="1" w:styleId="TitleChar" w:type="character">
-    <w:name w:val="Title Char"/>
-    <w:basedOn w:val="DefaultParagraphFont"/>
-    <w:link w:val="Title"/>
-    <w:uiPriority w:val="10"/>
-    <w:rsid w:val="00A10FD9"/>
-    <w:rPr>
-      <w:rFonts w:asciiTheme="majorHAnsi" w:cstheme="majorBidi" w:eastAsiaTheme="majorEastAsia" w:hAnsiTheme="majorHAnsi"/>
-      <w:sz w:val="56"/>
-      <w:szCs w:val="56"/>
-    </w:rPr>
-  </w:style>
-  <w:style w:styleId="Subtitle" w:type="paragraph">
-    <w:name w:val="Subtitle"/>
-    <w:basedOn w:val="Title"/>
-    <w:next w:val="BodyText"/>
-    <w:link w:val="SubtitleChar"/>
-    <w:uiPriority w:val="11"/>
-    <w:qFormat/>
-    <w:rsid w:val="00A10FD9"/>
-    <w:pPr>
-      <w:numPr>
-        <w:ilvl w:val="1"/>
-      </w:numPr>
-    </w:pPr>
-    <w:rPr>
-      <w:rFonts w:cstheme="majorBidi" w:eastAsiaTheme="majorEastAsia"/>
-      <w:spacing w:val="15"/>
-      <w:sz w:val="28"/>
-      <w:szCs w:val="28"/>
-    </w:rPr>
-  </w:style>
-  <w:style w:customStyle="1" w:styleId="SubtitleChar" w:type="character">
-    <w:name w:val="Subtitle Char"/>
-    <w:basedOn w:val="DefaultParagraphFont"/>
-    <w:link w:val="Subtitle"/>
-    <w:uiPriority w:val="11"/>
-    <w:rsid w:val="00A10FD9"/>
-    <w:rPr>
-      <w:rFonts w:cstheme="majorBidi" w:eastAsiaTheme="majorEastAsia"/>
-      <w:color w:themeColor="text1" w:themeTint="A6" w:val="595959"/>
-      <w:spacing w:val="15"/>
-      <w:sz w:val="28"/>
-      <w:szCs w:val="28"/>
-    </w:rPr>
-  </w:style>
-  <w:style w:customStyle="1" w:styleId="Author" w:type="paragraph">
-    <w:name w:val="Author"/>
-    <w:basedOn w:val="Title"/>
-    <w:next w:val="BodyText"/>
-    <w:qFormat/>
-    <w:pPr>
-      <w:keepNext/>
-      <w:keepLines/>
-    </w:pPr>
-    <w:rPr>
-      <w:sz w:val="24"/>
-      <w:szCs w:val="24"/>
-    </w:rPr>
-  </w:style>
-  <w:style w:styleId="Date" w:type="paragraph">
-    <w:name w:val="Date"/>
-    <w:basedOn w:val="Title"/>
-    <w:next w:val="BodyText"/>
-    <w:qFormat/>
-    <w:pPr>
-      <w:keepNext/>
-      <w:keepLines/>
-    </w:pPr>
-    <w:rPr>
-      <w:sz w:val="24"/>
-      <w:szCs w:val="24"/>
-    </w:rPr>
-  </w:style>
-  <w:style w:customStyle="1" w:styleId="AbstractTitle" w:type="paragraph">
-    <w:name w:val="Abstract Title"/>
-    <w:basedOn w:val="Normal"/>
-    <w:next w:val="Abstract"/>
-    <w:qFormat/>
-    <w:pPr>
-      <w:keepNext/>
-      <w:keepLines/>
-      <w:spacing w:after="0" w:before="300"/>
-      <w:jc w:val="center"/>
-    </w:pPr>
-    <w:rPr>
-      <w:b/>
-      <w:sz w:val="20"/>
-      <w:szCs w:val="20"/>
-    </w:rPr>
-  </w:style>
-  <w:style w:customStyle="1" w:styleId="Abstract" w:type="paragraph">
-    <w:name w:val="Abstract"/>
-    <w:basedOn w:val="Normal"/>
-    <w:next w:val="BodyText"/>
-    <w:qFormat/>
-    <w:pPr>
-      <w:keepNext/>
-      <w:keepLines/>
-      <w:spacing w:after="300" w:before="100"/>
-    </w:pPr>
-    <w:rPr>
-      <w:sz w:val="20"/>
-      <w:szCs w:val="20"/>
-    </w:rPr>
-  </w:style>
-  <w:style w:styleId="Bibliography" w:type="paragraph">
-    <w:name w:val="Bibliography"/>
-    <w:basedOn w:val="Normal"/>
-    <w:next w:val="Bibliography"/>
-    <w:qFormat/>
-    <w:pPr/>
-    <w:rPr/>
-  </w:style>
-  <w:style w:styleId="Heading1" w:type="paragraph">
+  <w:style w:type="paragraph" w:styleId="Heading1">
     <w:name w:val="heading 1"/>
     <w:basedOn w:val="Normal"/>
     <w:next w:val="BodyText"/>
@@ -635,17 +821,17 @@
     <w:pPr>
       <w:keepNext/>
       <w:keepLines/>
-      <w:spacing w:after="80" w:before="360"/>
+      <w:spacing w:before="360" w:after="80"/>
       <w:outlineLvl w:val="0"/>
     </w:pPr>
     <w:rPr>
-      <w:rFonts w:asciiTheme="majorHAnsi" w:cstheme="majorBidi" w:eastAsiaTheme="majorEastAsia" w:hAnsiTheme="majorHAnsi"/>
-      <w:color w:themeColor="accent1" w:themeShade="BF" w:val="0F4761"/>
+      <w:rFonts w:asciiTheme="majorHAnsi" w:eastAsiaTheme="majorEastAsia" w:hAnsiTheme="majorHAnsi" w:cstheme="majorBidi"/>
+      <w:color w:val="0F4761" w:themeColor="accent1" w:themeShade="BF"/>
       <w:sz w:val="40"/>
       <w:szCs w:val="40"/>
     </w:rPr>
   </w:style>
-  <w:style w:styleId="Heading2" w:type="paragraph">
+  <w:style w:type="paragraph" w:styleId="Heading2">
     <w:name w:val="heading 2"/>
     <w:basedOn w:val="Normal"/>
     <w:next w:val="BodyText"/>
@@ -658,17 +844,17 @@
     <w:pPr>
       <w:keepNext/>
       <w:keepLines/>
-      <w:spacing w:after="80" w:before="160"/>
+      <w:spacing w:before="160" w:after="80"/>
       <w:outlineLvl w:val="1"/>
     </w:pPr>
     <w:rPr>
-      <w:rFonts w:asciiTheme="majorHAnsi" w:cstheme="majorBidi" w:eastAsiaTheme="majorEastAsia" w:hAnsiTheme="majorHAnsi"/>
-      <w:color w:themeColor="accent1" w:themeShade="BF" w:val="0F4761"/>
+      <w:rFonts w:asciiTheme="majorHAnsi" w:eastAsiaTheme="majorEastAsia" w:hAnsiTheme="majorHAnsi" w:cstheme="majorBidi"/>
+      <w:color w:val="0F4761" w:themeColor="accent1" w:themeShade="BF"/>
       <w:sz w:val="32"/>
       <w:szCs w:val="32"/>
     </w:rPr>
   </w:style>
-  <w:style w:styleId="Heading3" w:type="paragraph">
+  <w:style w:type="paragraph" w:styleId="Heading3">
     <w:name w:val="heading 3"/>
     <w:basedOn w:val="Normal"/>
     <w:next w:val="BodyText"/>
@@ -681,17 +867,17 @@
     <w:pPr>
       <w:keepNext/>
       <w:keepLines/>
-      <w:spacing w:after="80" w:before="160"/>
+      <w:spacing w:before="160" w:after="80"/>
       <w:outlineLvl w:val="2"/>
     </w:pPr>
     <w:rPr>
-      <w:rFonts w:cstheme="majorBidi" w:eastAsiaTheme="majorEastAsia"/>
-      <w:color w:themeColor="accent1" w:themeShade="BF" w:val="0F4761"/>
+      <w:rFonts w:eastAsiaTheme="majorEastAsia" w:cstheme="majorBidi"/>
+      <w:color w:val="0F4761" w:themeColor="accent1" w:themeShade="BF"/>
       <w:sz w:val="28"/>
       <w:szCs w:val="28"/>
     </w:rPr>
   </w:style>
-  <w:style w:styleId="Heading4" w:type="paragraph">
+  <w:style w:type="paragraph" w:styleId="Heading4">
     <w:name w:val="heading 4"/>
     <w:basedOn w:val="Normal"/>
     <w:next w:val="BodyText"/>
@@ -704,17 +890,17 @@
     <w:pPr>
       <w:keepNext/>
       <w:keepLines/>
-      <w:spacing w:after="40" w:before="80"/>
+      <w:spacing w:before="80" w:after="40"/>
       <w:outlineLvl w:val="3"/>
     </w:pPr>
     <w:rPr>
-      <w:rFonts w:cstheme="majorBidi" w:eastAsiaTheme="majorEastAsia"/>
+      <w:rFonts w:eastAsiaTheme="majorEastAsia" w:cstheme="majorBidi"/>
       <w:i/>
       <w:iCs/>
-      <w:color w:themeColor="accent1" w:themeShade="BF" w:val="0F4761"/>
-    </w:rPr>
-  </w:style>
-  <w:style w:styleId="Heading5" w:type="paragraph">
+      <w:color w:val="0F4761" w:themeColor="accent1" w:themeShade="BF"/>
+    </w:rPr>
+  </w:style>
+  <w:style w:type="paragraph" w:styleId="Heading5">
     <w:name w:val="heading 5"/>
     <w:basedOn w:val="Normal"/>
     <w:next w:val="BodyText"/>
@@ -727,15 +913,15 @@
     <w:pPr>
       <w:keepNext/>
       <w:keepLines/>
-      <w:spacing w:after="40" w:before="80"/>
+      <w:spacing w:before="80" w:after="40"/>
       <w:outlineLvl w:val="4"/>
     </w:pPr>
     <w:rPr>
-      <w:rFonts w:cstheme="majorBidi" w:eastAsiaTheme="majorEastAsia"/>
-      <w:color w:themeColor="accent1" w:themeShade="BF" w:val="0F4761"/>
-    </w:rPr>
-  </w:style>
-  <w:style w:styleId="Heading6" w:type="paragraph">
+      <w:rFonts w:eastAsiaTheme="majorEastAsia" w:cstheme="majorBidi"/>
+      <w:color w:val="0F4761" w:themeColor="accent1" w:themeShade="BF"/>
+    </w:rPr>
+  </w:style>
+  <w:style w:type="paragraph" w:styleId="Heading6">
     <w:name w:val="heading 6"/>
     <w:basedOn w:val="Normal"/>
     <w:next w:val="BodyText"/>
@@ -748,17 +934,17 @@
     <w:pPr>
       <w:keepNext/>
       <w:keepLines/>
-      <w:spacing w:after="0" w:before="40"/>
+      <w:spacing w:before="40" w:after="0"/>
       <w:outlineLvl w:val="5"/>
     </w:pPr>
     <w:rPr>
-      <w:rFonts w:cstheme="majorBidi" w:eastAsiaTheme="majorEastAsia"/>
+      <w:rFonts w:eastAsiaTheme="majorEastAsia" w:cstheme="majorBidi"/>
       <w:i/>
       <w:iCs/>
-      <w:color w:themeColor="text1" w:themeTint="A6" w:val="595959"/>
-    </w:rPr>
-  </w:style>
-  <w:style w:styleId="Heading7" w:type="paragraph">
+      <w:color w:val="595959" w:themeColor="text1" w:themeTint="A6"/>
+    </w:rPr>
+  </w:style>
+  <w:style w:type="paragraph" w:styleId="Heading7">
     <w:name w:val="heading 7"/>
     <w:basedOn w:val="Normal"/>
     <w:next w:val="BodyText"/>
@@ -771,15 +957,15 @@
     <w:pPr>
       <w:keepNext/>
       <w:keepLines/>
-      <w:spacing w:after="0" w:before="40"/>
+      <w:spacing w:before="40" w:after="0"/>
       <w:outlineLvl w:val="6"/>
     </w:pPr>
     <w:rPr>
-      <w:rFonts w:cstheme="majorBidi" w:eastAsiaTheme="majorEastAsia"/>
-      <w:color w:themeColor="text1" w:themeTint="A6" w:val="595959"/>
-    </w:rPr>
-  </w:style>
-  <w:style w:styleId="Heading8" w:type="paragraph">
+      <w:rFonts w:eastAsiaTheme="majorEastAsia" w:cstheme="majorBidi"/>
+      <w:color w:val="595959" w:themeColor="text1" w:themeTint="A6"/>
+    </w:rPr>
+  </w:style>
+  <w:style w:type="paragraph" w:styleId="Heading8">
     <w:name w:val="heading 8"/>
     <w:basedOn w:val="Normal"/>
     <w:next w:val="BodyText"/>
@@ -796,13 +982,13 @@
       <w:outlineLvl w:val="7"/>
     </w:pPr>
     <w:rPr>
-      <w:rFonts w:cstheme="majorBidi" w:eastAsiaTheme="majorEastAsia"/>
+      <w:rFonts w:eastAsiaTheme="majorEastAsia" w:cstheme="majorBidi"/>
       <w:i/>
       <w:iCs/>
-      <w:color w:themeColor="text1" w:themeTint="D8" w:val="272727"/>
-    </w:rPr>
-  </w:style>
-  <w:style w:styleId="Heading9" w:type="paragraph">
+      <w:color w:val="272727" w:themeColor="text1" w:themeTint="D8"/>
+    </w:rPr>
+  </w:style>
+  <w:style w:type="paragraph" w:styleId="Heading9">
     <w:name w:val="heading 9"/>
     <w:basedOn w:val="Normal"/>
     <w:next w:val="BodyText"/>
@@ -819,24 +1005,202 @@
       <w:outlineLvl w:val="8"/>
     </w:pPr>
     <w:rPr>
-      <w:rFonts w:cstheme="majorBidi" w:eastAsiaTheme="majorEastAsia"/>
-      <w:color w:themeColor="text1" w:themeTint="D8" w:val="272727"/>
-    </w:rPr>
-  </w:style>
-  <w:style w:customStyle="1" w:styleId="Heading1Char" w:type="character">
+      <w:rFonts w:eastAsiaTheme="majorEastAsia" w:cstheme="majorBidi"/>
+      <w:color w:val="272727" w:themeColor="text1" w:themeTint="D8"/>
+    </w:rPr>
+  </w:style>
+  <w:style w:type="character" w:default="1" w:styleId="DefaultParagraphFont">
+    <w:name w:val="Default Paragraph Font"/>
+    <w:uiPriority w:val="1"/>
+    <w:semiHidden/>
+    <w:unhideWhenUsed/>
+  </w:style>
+  <w:style w:type="table" w:default="1" w:styleId="TableNormal">
+    <w:name w:val="Normal Table"/>
+    <w:uiPriority w:val="99"/>
+    <w:semiHidden/>
+    <w:unhideWhenUsed/>
+    <w:tblPr>
+      <w:tblInd w:w="0" w:type="dxa"/>
+      <w:tblCellMar>
+        <w:top w:w="0" w:type="dxa"/>
+        <w:left w:w="108" w:type="dxa"/>
+        <w:bottom w:w="0" w:type="dxa"/>
+        <w:right w:w="108" w:type="dxa"/>
+      </w:tblCellMar>
+    </w:tblPr>
+  </w:style>
+  <w:style w:type="numbering" w:default="1" w:styleId="NoList">
+    <w:name w:val="No List"/>
+    <w:uiPriority w:val="99"/>
+    <w:semiHidden/>
+    <w:unhideWhenUsed/>
+  </w:style>
+  <w:style w:type="paragraph" w:styleId="BodyText">
+    <w:name w:val="Body Text"/>
+    <w:basedOn w:val="Normal"/>
+    <w:qFormat/>
+    <w:pPr>
+      <w:spacing w:before="180" w:after="180"/>
+    </w:pPr>
+  </w:style>
+  <w:style w:type="paragraph" w:customStyle="1" w:styleId="FirstParagraph">
+    <w:name w:val="First Paragraph"/>
+    <w:basedOn w:val="BodyText"/>
+    <w:next w:val="BodyText"/>
+    <w:qFormat/>
+  </w:style>
+  <w:style w:type="paragraph" w:customStyle="1" w:styleId="Compact">
+    <w:name w:val="Compact"/>
+    <w:basedOn w:val="BodyText"/>
+    <w:qFormat/>
+    <w:pPr>
+      <w:spacing w:before="36" w:after="36"/>
+    </w:pPr>
+  </w:style>
+  <w:style w:type="paragraph" w:styleId="Title">
+    <w:name w:val="Title"/>
+    <w:basedOn w:val="Normal"/>
+    <w:next w:val="BodyText"/>
+    <w:link w:val="TitleChar"/>
+    <w:uiPriority w:val="10"/>
+    <w:qFormat/>
+    <w:rsid w:val="00A10FD9"/>
+    <w:pPr>
+      <w:spacing w:after="80"/>
+      <w:contextualSpacing/>
+      <w:jc w:val="center"/>
+    </w:pPr>
+    <w:rPr>
+      <w:rFonts w:asciiTheme="majorHAnsi" w:eastAsiaTheme="majorEastAsia" w:hAnsiTheme="majorHAnsi" w:cstheme="majorBidi"/>
+      <w:sz w:val="56"/>
+      <w:szCs w:val="56"/>
+    </w:rPr>
+  </w:style>
+  <w:style w:type="character" w:customStyle="1" w:styleId="TitleChar">
+    <w:name w:val="Title Char"/>
+    <w:basedOn w:val="DefaultParagraphFont"/>
+    <w:link w:val="Title"/>
+    <w:uiPriority w:val="10"/>
+    <w:rsid w:val="00A10FD9"/>
+    <w:rPr>
+      <w:rFonts w:asciiTheme="majorHAnsi" w:eastAsiaTheme="majorEastAsia" w:hAnsiTheme="majorHAnsi" w:cstheme="majorBidi"/>
+      <w:sz w:val="56"/>
+      <w:szCs w:val="56"/>
+    </w:rPr>
+  </w:style>
+  <w:style w:type="paragraph" w:styleId="Subtitle">
+    <w:name w:val="Subtitle"/>
+    <w:basedOn w:val="Title"/>
+    <w:next w:val="BodyText"/>
+    <w:link w:val="SubtitleChar"/>
+    <w:uiPriority w:val="11"/>
+    <w:qFormat/>
+    <w:rsid w:val="00A10FD9"/>
+    <w:pPr>
+      <w:numPr>
+        <w:ilvl w:val="1"/>
+      </w:numPr>
+    </w:pPr>
+    <w:rPr>
+      <w:spacing w:val="15"/>
+      <w:sz w:val="28"/>
+      <w:szCs w:val="28"/>
+    </w:rPr>
+  </w:style>
+  <w:style w:type="character" w:customStyle="1" w:styleId="SubtitleChar">
+    <w:name w:val="Subtitle Char"/>
+    <w:basedOn w:val="DefaultParagraphFont"/>
+    <w:link w:val="Subtitle"/>
+    <w:uiPriority w:val="11"/>
+    <w:rsid w:val="00A10FD9"/>
+    <w:rPr>
+      <w:rFonts w:eastAsiaTheme="majorEastAsia" w:cstheme="majorBidi"/>
+      <w:color w:val="595959" w:themeColor="text1" w:themeTint="A6"/>
+      <w:spacing w:val="15"/>
+      <w:sz w:val="28"/>
+      <w:szCs w:val="28"/>
+    </w:rPr>
+  </w:style>
+  <w:style w:type="paragraph" w:customStyle="1" w:styleId="Author">
+    <w:name w:val="Author"/>
+    <w:basedOn w:val="Title"/>
+    <w:next w:val="BodyText"/>
+    <w:qFormat/>
+    <w:pPr>
+      <w:keepNext/>
+      <w:keepLines/>
+    </w:pPr>
+    <w:rPr>
+      <w:sz w:val="24"/>
+      <w:szCs w:val="24"/>
+    </w:rPr>
+  </w:style>
+  <w:style w:type="paragraph" w:styleId="Date">
+    <w:name w:val="Date"/>
+    <w:basedOn w:val="Title"/>
+    <w:next w:val="BodyText"/>
+    <w:qFormat/>
+    <w:pPr>
+      <w:keepNext/>
+      <w:keepLines/>
+    </w:pPr>
+    <w:rPr>
+      <w:sz w:val="24"/>
+      <w:szCs w:val="24"/>
+    </w:rPr>
+  </w:style>
+  <w:style w:type="paragraph" w:customStyle="1" w:styleId="AbstractTitle">
+    <w:name w:val="Abstract Title"/>
+    <w:basedOn w:val="Normal"/>
+    <w:next w:val="Abstract"/>
+    <w:qFormat/>
+    <w:pPr>
+      <w:keepNext/>
+      <w:keepLines/>
+      <w:spacing w:before="300" w:after="0"/>
+      <w:jc w:val="center"/>
+    </w:pPr>
+    <w:rPr>
+      <w:b/>
+      <w:sz w:val="20"/>
+      <w:szCs w:val="20"/>
+    </w:rPr>
+  </w:style>
+  <w:style w:type="paragraph" w:customStyle="1" w:styleId="Abstract">
+    <w:name w:val="Abstract"/>
+    <w:basedOn w:val="Normal"/>
+    <w:next w:val="BodyText"/>
+    <w:qFormat/>
+    <w:pPr>
+      <w:keepNext/>
+      <w:keepLines/>
+      <w:spacing w:before="100" w:after="300"/>
+    </w:pPr>
+    <w:rPr>
+      <w:sz w:val="20"/>
+      <w:szCs w:val="20"/>
+    </w:rPr>
+  </w:style>
+  <w:style w:type="paragraph" w:styleId="Bibliography">
+    <w:name w:val="Bibliography"/>
+    <w:basedOn w:val="Normal"/>
+    <w:qFormat/>
+  </w:style>
+  <w:style w:type="character" w:customStyle="1" w:styleId="Heading1Char">
     <w:name w:val="Heading 1 Char"/>
     <w:basedOn w:val="DefaultParagraphFont"/>
     <w:link w:val="Heading1"/>
     <w:uiPriority w:val="9"/>
     <w:rsid w:val="00A10FD9"/>
     <w:rPr>
-      <w:rFonts w:asciiTheme="majorHAnsi" w:cstheme="majorBidi" w:eastAsiaTheme="majorEastAsia" w:hAnsiTheme="majorHAnsi"/>
-      <w:color w:themeColor="accent1" w:themeShade="BF" w:val="0F4761"/>
+      <w:rFonts w:asciiTheme="majorHAnsi" w:eastAsiaTheme="majorEastAsia" w:hAnsiTheme="majorHAnsi" w:cstheme="majorBidi"/>
+      <w:color w:val="0F4761" w:themeColor="accent1" w:themeShade="BF"/>
       <w:sz w:val="40"/>
       <w:szCs w:val="40"/>
     </w:rPr>
   </w:style>
-  <w:style w:customStyle="1" w:styleId="Heading2Char" w:type="character">
+  <w:style w:type="character" w:customStyle="1" w:styleId="Heading2Char">
     <w:name w:val="Heading 2 Char"/>
     <w:basedOn w:val="DefaultParagraphFont"/>
     <w:link w:val="Heading2"/>
@@ -844,13 +1208,13 @@
     <w:semiHidden/>
     <w:rsid w:val="00A10FD9"/>
     <w:rPr>
-      <w:rFonts w:asciiTheme="majorHAnsi" w:cstheme="majorBidi" w:eastAsiaTheme="majorEastAsia" w:hAnsiTheme="majorHAnsi"/>
-      <w:color w:themeColor="accent1" w:themeShade="BF" w:val="0F4761"/>
+      <w:rFonts w:asciiTheme="majorHAnsi" w:eastAsiaTheme="majorEastAsia" w:hAnsiTheme="majorHAnsi" w:cstheme="majorBidi"/>
+      <w:color w:val="0F4761" w:themeColor="accent1" w:themeShade="BF"/>
       <w:sz w:val="32"/>
       <w:szCs w:val="32"/>
     </w:rPr>
   </w:style>
-  <w:style w:customStyle="1" w:styleId="Heading3Char" w:type="character">
+  <w:style w:type="character" w:customStyle="1" w:styleId="Heading3Char">
     <w:name w:val="Heading 3 Char"/>
     <w:basedOn w:val="DefaultParagraphFont"/>
     <w:link w:val="Heading3"/>
@@ -858,13 +1222,13 @@
     <w:semiHidden/>
     <w:rsid w:val="00A10FD9"/>
     <w:rPr>
-      <w:rFonts w:cstheme="majorBidi" w:eastAsiaTheme="majorEastAsia"/>
-      <w:color w:themeColor="accent1" w:themeShade="BF" w:val="0F4761"/>
+      <w:rFonts w:eastAsiaTheme="majorEastAsia" w:cstheme="majorBidi"/>
+      <w:color w:val="0F4761" w:themeColor="accent1" w:themeShade="BF"/>
       <w:sz w:val="28"/>
       <w:szCs w:val="28"/>
     </w:rPr>
   </w:style>
-  <w:style w:customStyle="1" w:styleId="Heading4Char" w:type="character">
+  <w:style w:type="character" w:customStyle="1" w:styleId="Heading4Char">
     <w:name w:val="Heading 4 Char"/>
     <w:basedOn w:val="DefaultParagraphFont"/>
     <w:link w:val="Heading4"/>
@@ -872,13 +1236,13 @@
     <w:semiHidden/>
     <w:rsid w:val="00A10FD9"/>
     <w:rPr>
-      <w:rFonts w:cstheme="majorBidi" w:eastAsiaTheme="majorEastAsia"/>
+      <w:rFonts w:eastAsiaTheme="majorEastAsia" w:cstheme="majorBidi"/>
       <w:i/>
       <w:iCs/>
-      <w:color w:themeColor="accent1" w:themeShade="BF" w:val="0F4761"/>
-    </w:rPr>
-  </w:style>
-  <w:style w:customStyle="1" w:styleId="Heading5Char" w:type="character">
+      <w:color w:val="0F4761" w:themeColor="accent1" w:themeShade="BF"/>
+    </w:rPr>
+  </w:style>
+  <w:style w:type="character" w:customStyle="1" w:styleId="Heading5Char">
     <w:name w:val="Heading 5 Char"/>
     <w:basedOn w:val="DefaultParagraphFont"/>
     <w:link w:val="Heading5"/>
@@ -886,11 +1250,11 @@
     <w:semiHidden/>
     <w:rsid w:val="00A10FD9"/>
     <w:rPr>
-      <w:rFonts w:cstheme="majorBidi" w:eastAsiaTheme="majorEastAsia"/>
-      <w:color w:themeColor="accent1" w:themeShade="BF" w:val="0F4761"/>
-    </w:rPr>
-  </w:style>
-  <w:style w:customStyle="1" w:styleId="Heading6Char" w:type="character">
+      <w:rFonts w:eastAsiaTheme="majorEastAsia" w:cstheme="majorBidi"/>
+      <w:color w:val="0F4761" w:themeColor="accent1" w:themeShade="BF"/>
+    </w:rPr>
+  </w:style>
+  <w:style w:type="character" w:customStyle="1" w:styleId="Heading6Char">
     <w:name w:val="Heading 6 Char"/>
     <w:basedOn w:val="DefaultParagraphFont"/>
     <w:link w:val="Heading6"/>
@@ -898,13 +1262,13 @@
     <w:semiHidden/>
     <w:rsid w:val="00A10FD9"/>
     <w:rPr>
-      <w:rFonts w:cstheme="majorBidi" w:eastAsiaTheme="majorEastAsia"/>
+      <w:rFonts w:eastAsiaTheme="majorEastAsia" w:cstheme="majorBidi"/>
       <w:i/>
       <w:iCs/>
-      <w:color w:themeColor="text1" w:themeTint="A6" w:val="595959"/>
-    </w:rPr>
-  </w:style>
-  <w:style w:customStyle="1" w:styleId="Heading7Char" w:type="character">
+      <w:color w:val="595959" w:themeColor="text1" w:themeTint="A6"/>
+    </w:rPr>
+  </w:style>
+  <w:style w:type="character" w:customStyle="1" w:styleId="Heading7Char">
     <w:name w:val="Heading 7 Char"/>
     <w:basedOn w:val="DefaultParagraphFont"/>
     <w:link w:val="Heading7"/>
@@ -912,11 +1276,11 @@
     <w:semiHidden/>
     <w:rsid w:val="00A10FD9"/>
     <w:rPr>
-      <w:rFonts w:cstheme="majorBidi" w:eastAsiaTheme="majorEastAsia"/>
-      <w:color w:themeColor="text1" w:themeTint="A6" w:val="595959"/>
-    </w:rPr>
-  </w:style>
-  <w:style w:customStyle="1" w:styleId="Heading8Char" w:type="character">
+      <w:rFonts w:eastAsiaTheme="majorEastAsia" w:cstheme="majorBidi"/>
+      <w:color w:val="595959" w:themeColor="text1" w:themeTint="A6"/>
+    </w:rPr>
+  </w:style>
+  <w:style w:type="character" w:customStyle="1" w:styleId="Heading8Char">
     <w:name w:val="Heading 8 Char"/>
     <w:basedOn w:val="DefaultParagraphFont"/>
     <w:link w:val="Heading8"/>
@@ -924,13 +1288,13 @@
     <w:semiHidden/>
     <w:rsid w:val="00A10FD9"/>
     <w:rPr>
-      <w:rFonts w:cstheme="majorBidi" w:eastAsiaTheme="majorEastAsia"/>
+      <w:rFonts w:eastAsiaTheme="majorEastAsia" w:cstheme="majorBidi"/>
       <w:i/>
       <w:iCs/>
-      <w:color w:themeColor="text1" w:themeTint="D8" w:val="272727"/>
-    </w:rPr>
-  </w:style>
-  <w:style w:customStyle="1" w:styleId="Heading9Char" w:type="character">
+      <w:color w:val="272727" w:themeColor="text1" w:themeTint="D8"/>
+    </w:rPr>
+  </w:style>
+  <w:style w:type="character" w:customStyle="1" w:styleId="Heading9Char">
     <w:name w:val="Heading 9 Char"/>
     <w:basedOn w:val="DefaultParagraphFont"/>
     <w:link w:val="Heading9"/>
@@ -938,11 +1302,11 @@
     <w:semiHidden/>
     <w:rsid w:val="00A10FD9"/>
     <w:rPr>
-      <w:rFonts w:cstheme="majorBidi" w:eastAsiaTheme="majorEastAsia"/>
-      <w:color w:themeColor="text1" w:themeTint="D8" w:val="272727"/>
-    </w:rPr>
-  </w:style>
-  <w:style w:styleId="BlockText" w:type="paragraph">
+      <w:rFonts w:eastAsiaTheme="majorEastAsia" w:cstheme="majorBidi"/>
+      <w:color w:val="272727" w:themeColor="text1" w:themeTint="D8"/>
+    </w:rPr>
+  </w:style>
+  <w:style w:type="paragraph" w:styleId="BlockText">
     <w:name w:val="Block Text"/>
     <w:basedOn w:val="BodyText"/>
     <w:next w:val="BodyText"/>
@@ -950,19 +1314,18 @@
     <w:unhideWhenUsed/>
     <w:qFormat/>
     <w:pPr>
-      <w:spacing w:after="100" w:before="100"/>
-      <w:ind w:firstLine="0" w:left="480" w:right="480"/>
-    </w:pPr>
-  </w:style>
-  <w:style w:styleId="FootnoteText" w:type="paragraph">
-    <w:name w:val="Footnote Text"/>
+      <w:spacing w:before="100" w:after="100"/>
+      <w:ind w:left="480" w:right="480"/>
+    </w:pPr>
+  </w:style>
+  <w:style w:type="paragraph" w:styleId="FootnoteText">
+    <w:name w:val="footnote text"/>
     <w:basedOn w:val="Normal"/>
-    <w:next w:val="FootnoteText"/>
     <w:uiPriority w:val="9"/>
     <w:unhideWhenUsed/>
     <w:qFormat/>
   </w:style>
-  <w:style w:styleId="FootnoteBlockText" w:type="paragraph">
+  <w:style w:type="paragraph" w:customStyle="1" w:styleId="FootnoteBlockText">
     <w:name w:val="Footnote Block Text"/>
     <w:basedOn w:val="FootnoteText"/>
     <w:next w:val="FootnoteText"/>
@@ -970,40 +1333,35 @@
     <w:unhideWhenUsed/>
     <w:qFormat/>
     <w:pPr>
-      <w:spacing w:after="100" w:before="100"/>
-      <w:ind w:firstLine="0" w:left="480" w:right="480"/>
-    </w:pPr>
-  </w:style>
-  <w:style w:default="1" w:styleId="DefaultParagraphFont" w:type="character">
-    <w:name w:val="Default Paragraph Font"/>
+      <w:spacing w:before="100" w:after="100"/>
+      <w:ind w:left="480" w:right="480"/>
+    </w:pPr>
+  </w:style>
+  <w:style w:type="table" w:customStyle="1" w:styleId="Table">
+    <w:name w:val="Table"/>
     <w:semiHidden/>
     <w:unhideWhenUsed/>
-  </w:style>
-  <w:style w:default="1" w:styleId="Table" w:type="table">
-    <w:name w:val="Table"/>
-    <w:basedOn w:val="TableNormal"/>
-    <w:semiHidden/>
-    <w:unhideWhenUsed/>
     <w:qFormat/>
     <w:tblPr>
-      <w:tblInd w:type="dxa" w:w="0"/>
+      <w:tblInd w:w="0" w:type="dxa"/>
       <w:tblCellMar>
-        <w:top w:type="dxa" w:w="0"/>
-        <w:left w:type="dxa" w:w="108"/>
-        <w:bottom w:type="dxa" w:w="0"/>
-        <w:right w:type="dxa" w:w="108"/>
+        <w:top w:w="0" w:type="dxa"/>
+        <w:left w:w="108" w:type="dxa"/>
+        <w:bottom w:w="0" w:type="dxa"/>
+        <w:right w:w="108" w:type="dxa"/>
       </w:tblCellMar>
     </w:tblPr>
     <w:tblStylePr w:type="firstRow">
+      <w:tblPr/>
       <w:tcPr>
         <w:tcBorders>
-          <w:bottom w:val="single"/>
+          <w:bottom w:val="single" w:sz="0" w:space="0" w:color="auto"/>
         </w:tcBorders>
         <w:vAlign w:val="bottom"/>
       </w:tcPr>
     </w:tblStylePr>
   </w:style>
-  <w:style w:customStyle="1" w:styleId="DefinitionTerm" w:type="paragraph">
+  <w:style w:type="paragraph" w:customStyle="1" w:styleId="DefinitionTerm">
     <w:name w:val="Definition Term"/>
     <w:basedOn w:val="Normal"/>
     <w:next w:val="Definition"/>
@@ -1016,75 +1374,76 @@
       <w:b/>
     </w:rPr>
   </w:style>
-  <w:style w:customStyle="1" w:styleId="Definition" w:type="paragraph">
+  <w:style w:type="paragraph" w:customStyle="1" w:styleId="Definition">
     <w:name w:val="Definition"/>
     <w:basedOn w:val="Normal"/>
   </w:style>
-  <w:style w:styleId="Caption" w:type="paragraph">
-    <w:name w:val="Caption"/>
+  <w:style w:type="paragraph" w:styleId="Caption">
+    <w:name w:val="caption"/>
     <w:basedOn w:val="Normal"/>
-    <w:link w:val="BodyTextChar"/>
-    <w:pPr>
-      <w:spacing w:after="120" w:before="0"/>
+    <w:link w:val="CaptionChar"/>
+    <w:pPr>
+      <w:spacing w:after="120"/>
     </w:pPr>
     <w:rPr>
       <w:i/>
     </w:rPr>
   </w:style>
-  <w:style w:customStyle="1" w:styleId="TableCaption" w:type="paragraph">
+  <w:style w:type="paragraph" w:customStyle="1" w:styleId="TableCaption">
     <w:name w:val="Table Caption"/>
     <w:basedOn w:val="Caption"/>
     <w:pPr>
       <w:keepNext/>
     </w:pPr>
   </w:style>
-  <w:style w:customStyle="1" w:styleId="ImageCaption" w:type="paragraph">
+  <w:style w:type="paragraph" w:customStyle="1" w:styleId="ImageCaption">
     <w:name w:val="Image Caption"/>
     <w:basedOn w:val="Caption"/>
   </w:style>
-  <w:style w:customStyle="1" w:styleId="Figure" w:type="paragraph">
+  <w:style w:type="paragraph" w:customStyle="1" w:styleId="Figure">
     <w:name w:val="Figure"/>
     <w:basedOn w:val="Normal"/>
   </w:style>
-  <w:style w:customStyle="1" w:styleId="CaptionedFigure" w:type="paragraph">
+  <w:style w:type="paragraph" w:customStyle="1" w:styleId="CaptionedFigure">
     <w:name w:val="Captioned Figure"/>
     <w:basedOn w:val="Figure"/>
     <w:pPr>
       <w:keepNext/>
     </w:pPr>
   </w:style>
-  <w:style w:customStyle="1" w:styleId="BodyTextChar" w:type="character">
-    <w:name w:val="Body Text Char"/>
+  <w:style w:type="character" w:customStyle="1" w:styleId="CaptionChar">
+    <w:name w:val="Caption Char"/>
     <w:basedOn w:val="DefaultParagraphFont"/>
-    <w:link w:val="BodyText"/>
-  </w:style>
-  <w:style w:customStyle="1" w:styleId="VerbatimChar" w:type="character">
+    <w:link w:val="Caption"/>
+  </w:style>
+  <w:style w:type="character" w:customStyle="1" w:styleId="VerbatimChar">
     <w:name w:val="Verbatim Char"/>
-    <w:basedOn w:val="BodyTextChar"/>
-    <w:rPr>
-      <w:rFonts w:ascii="Consolas" w:hAnsi="Consolas"/>
-      <w:sz w:val="22"/>
-    </w:rPr>
-  </w:style>
-  <w:style w:customStyle="1" w:styleId="SectionNumber" w:type="character">
+    <w:basedOn w:val="CaptionChar"/>
+    <w:link w:val="SourceCode"/>
+    <w:rPr>
+      <w:rFonts w:ascii="Consolas" w:hAnsi="Consolas"/>
+      <w:sz w:val="22"/>
+    </w:rPr>
+  </w:style>
+  <w:style w:type="character" w:customStyle="1" w:styleId="SectionNumber">
     <w:name w:val="Section Number"/>
-    <w:basedOn w:val="BodyTextChar"/>
-  </w:style>
-  <w:style w:styleId="FootnoteReference" w:type="character">
-    <w:name w:val="Footnote Reference"/>
-    <w:basedOn w:val="BodyTextChar"/>
+    <w:basedOn w:val="CaptionChar"/>
+  </w:style>
+  <w:style w:type="character" w:styleId="FootnoteReference">
+    <w:name w:val="footnote reference"/>
+    <w:basedOn w:val="CaptionChar"/>
     <w:rPr>
       <w:vertAlign w:val="superscript"/>
     </w:rPr>
   </w:style>
-  <w:style w:styleId="Hyperlink" w:type="character">
+  <w:style w:type="character" w:styleId="Hyperlink">
     <w:name w:val="Hyperlink"/>
-    <w:basedOn w:val="BodyTextChar"/>
-    <w:rPr>
-      <w:color w:themeColor="accent1" w:val="4F81BD"/>
-    </w:rPr>
-  </w:style>
-  <w:style w:styleId="TOCHeading" w:type="paragraph">
+    <w:basedOn w:val="CaptionChar"/>
+    <w:rPr>
+      <w:color w:val="156082" w:themeColor="accent1"/>
+    </w:rPr>
+  </w:style>
+  <w:style w:type="paragraph" w:styleId="TOCHeading">
     <w:name w:val="TOC Heading"/>
     <w:basedOn w:val="Heading1"/>
     <w:next w:val="BodyText"/>
@@ -1095,246 +1454,305 @@
       <w:spacing w:before="240" w:line="259" w:lineRule="auto"/>
       <w:outlineLvl w:val="9"/>
     </w:pPr>
-    <w:rPr>
-      <w:rFonts w:asciiTheme="majorHAnsi" w:cstheme="majorBidi" w:eastAsiaTheme="majorEastAsia" w:hAnsiTheme="majorHAnsi"/>
-      <w:b w:val="0"/>
-      <w:bCs w:val="0"/>
-      <w:color w:themeColor="accent1" w:themeShade="BF" w:val="365F91"/>
-    </w:rPr>
   </w:style>
   <w:style w:type="paragraph" w:customStyle="1" w:styleId="SourceCode">
     <w:name w:val="Source Code"/>
     <w:basedOn w:val="Normal"/>
     <w:link w:val="VerbatimChar"/>
     <w:pPr>
-      <w:wordWrap w:val="off"/>
+      <w:wordWrap w:val="0"/>
     </w:pPr>
   </w:style>
   <w:style w:type="character" w:customStyle="1" w:styleId="KeywordTok">
     <w:name w:val="KeywordTok"/>
     <w:basedOn w:val="VerbatimChar"/>
     <w:rPr>
+      <w:rFonts w:ascii="Consolas" w:hAnsi="Consolas"/>
       <w:b/>
       <w:color w:val="007020"/>
+      <w:sz w:val="22"/>
     </w:rPr>
   </w:style>
   <w:style w:type="character" w:customStyle="1" w:styleId="DataTypeTok">
     <w:name w:val="DataTypeTok"/>
     <w:basedOn w:val="VerbatimChar"/>
     <w:rPr>
+      <w:rFonts w:ascii="Consolas" w:hAnsi="Consolas"/>
       <w:color w:val="902000"/>
+      <w:sz w:val="22"/>
     </w:rPr>
   </w:style>
   <w:style w:type="character" w:customStyle="1" w:styleId="DecValTok">
     <w:name w:val="DecValTok"/>
     <w:basedOn w:val="VerbatimChar"/>
     <w:rPr>
-      <w:color w:val="40a070"/>
+      <w:rFonts w:ascii="Consolas" w:hAnsi="Consolas"/>
+      <w:color w:val="40A070"/>
+      <w:sz w:val="22"/>
     </w:rPr>
   </w:style>
   <w:style w:type="character" w:customStyle="1" w:styleId="BaseNTok">
     <w:name w:val="BaseNTok"/>
     <w:basedOn w:val="VerbatimChar"/>
     <w:rPr>
-      <w:color w:val="40a070"/>
+      <w:rFonts w:ascii="Consolas" w:hAnsi="Consolas"/>
+      <w:color w:val="40A070"/>
+      <w:sz w:val="22"/>
     </w:rPr>
   </w:style>
   <w:style w:type="character" w:customStyle="1" w:styleId="FloatTok">
     <w:name w:val="FloatTok"/>
     <w:basedOn w:val="VerbatimChar"/>
     <w:rPr>
-      <w:color w:val="40a070"/>
+      <w:rFonts w:ascii="Consolas" w:hAnsi="Consolas"/>
+      <w:color w:val="40A070"/>
+      <w:sz w:val="22"/>
     </w:rPr>
   </w:style>
   <w:style w:type="character" w:customStyle="1" w:styleId="ConstantTok">
     <w:name w:val="ConstantTok"/>
     <w:basedOn w:val="VerbatimChar"/>
     <w:rPr>
+      <w:rFonts w:ascii="Consolas" w:hAnsi="Consolas"/>
       <w:color w:val="880000"/>
+      <w:sz w:val="22"/>
     </w:rPr>
   </w:style>
   <w:style w:type="character" w:customStyle="1" w:styleId="CharTok">
     <w:name w:val="CharTok"/>
     <w:basedOn w:val="VerbatimChar"/>
     <w:rPr>
-      <w:color w:val="4070a0"/>
+      <w:rFonts w:ascii="Consolas" w:hAnsi="Consolas"/>
+      <w:color w:val="4070A0"/>
+      <w:sz w:val="22"/>
     </w:rPr>
   </w:style>
   <w:style w:type="character" w:customStyle="1" w:styleId="SpecialCharTok">
     <w:name w:val="SpecialCharTok"/>
     <w:basedOn w:val="VerbatimChar"/>
     <w:rPr>
-      <w:color w:val="4070a0"/>
+      <w:rFonts w:ascii="Consolas" w:hAnsi="Consolas"/>
+      <w:color w:val="4070A0"/>
+      <w:sz w:val="22"/>
     </w:rPr>
   </w:style>
   <w:style w:type="character" w:customStyle="1" w:styleId="StringTok">
     <w:name w:val="StringTok"/>
     <w:basedOn w:val="VerbatimChar"/>
     <w:rPr>
-      <w:color w:val="4070a0"/>
+      <w:rFonts w:ascii="Consolas" w:hAnsi="Consolas"/>
+      <w:color w:val="4070A0"/>
+      <w:sz w:val="22"/>
     </w:rPr>
   </w:style>
   <w:style w:type="character" w:customStyle="1" w:styleId="VerbatimStringTok">
     <w:name w:val="VerbatimStringTok"/>
     <w:basedOn w:val="VerbatimChar"/>
     <w:rPr>
-      <w:color w:val="4070a0"/>
+      <w:rFonts w:ascii="Consolas" w:hAnsi="Consolas"/>
+      <w:color w:val="4070A0"/>
+      <w:sz w:val="22"/>
     </w:rPr>
   </w:style>
   <w:style w:type="character" w:customStyle="1" w:styleId="SpecialStringTok">
     <w:name w:val="SpecialStringTok"/>
     <w:basedOn w:val="VerbatimChar"/>
     <w:rPr>
-      <w:color w:val="bb6688"/>
+      <w:rFonts w:ascii="Consolas" w:hAnsi="Consolas"/>
+      <w:color w:val="BB6688"/>
+      <w:sz w:val="22"/>
     </w:rPr>
   </w:style>
   <w:style w:type="character" w:customStyle="1" w:styleId="ImportTok">
     <w:name w:val="ImportTok"/>
     <w:basedOn w:val="VerbatimChar"/>
     <w:rPr>
+      <w:rFonts w:ascii="Consolas" w:hAnsi="Consolas"/>
       <w:b/>
       <w:color w:val="008000"/>
+      <w:sz w:val="22"/>
     </w:rPr>
   </w:style>
   <w:style w:type="character" w:customStyle="1" w:styleId="CommentTok">
     <w:name w:val="CommentTok"/>
     <w:basedOn w:val="VerbatimChar"/>
     <w:rPr>
+      <w:rFonts w:ascii="Consolas" w:hAnsi="Consolas"/>
       <w:i/>
-      <w:color w:val="60a0b0"/>
+      <w:color w:val="60A0B0"/>
+      <w:sz w:val="22"/>
     </w:rPr>
   </w:style>
   <w:style w:type="character" w:customStyle="1" w:styleId="DocumentationTok">
     <w:name w:val="DocumentationTok"/>
     <w:basedOn w:val="VerbatimChar"/>
     <w:rPr>
+      <w:rFonts w:ascii="Consolas" w:hAnsi="Consolas"/>
       <w:i/>
-      <w:color w:val="ba2121"/>
+      <w:color w:val="BA2121"/>
+      <w:sz w:val="22"/>
     </w:rPr>
   </w:style>
   <w:style w:type="character" w:customStyle="1" w:styleId="AnnotationTok">
     <w:name w:val="AnnotationTok"/>
     <w:basedOn w:val="VerbatimChar"/>
     <w:rPr>
+      <w:rFonts w:ascii="Consolas" w:hAnsi="Consolas"/>
       <w:b/>
       <w:i/>
-      <w:color w:val="60a0b0"/>
+      <w:color w:val="60A0B0"/>
+      <w:sz w:val="22"/>
     </w:rPr>
   </w:style>
   <w:style w:type="character" w:customStyle="1" w:styleId="CommentVarTok">
     <w:name w:val="CommentVarTok"/>
     <w:basedOn w:val="VerbatimChar"/>
     <w:rPr>
+      <w:rFonts w:ascii="Consolas" w:hAnsi="Consolas"/>
       <w:b/>
       <w:i/>
-      <w:color w:val="60a0b0"/>
+      <w:color w:val="60A0B0"/>
+      <w:sz w:val="22"/>
     </w:rPr>
   </w:style>
   <w:style w:type="character" w:customStyle="1" w:styleId="OtherTok">
     <w:name w:val="OtherTok"/>
     <w:basedOn w:val="VerbatimChar"/>
     <w:rPr>
+      <w:rFonts w:ascii="Consolas" w:hAnsi="Consolas"/>
       <w:color w:val="007020"/>
+      <w:sz w:val="22"/>
     </w:rPr>
   </w:style>
   <w:style w:type="character" w:customStyle="1" w:styleId="FunctionTok">
     <w:name w:val="FunctionTok"/>
     <w:basedOn w:val="VerbatimChar"/>
     <w:rPr>
-      <w:color w:val="06287e"/>
+      <w:rFonts w:ascii="Consolas" w:hAnsi="Consolas"/>
+      <w:color w:val="06287E"/>
+      <w:sz w:val="22"/>
     </w:rPr>
   </w:style>
   <w:style w:type="character" w:customStyle="1" w:styleId="VariableTok">
     <w:name w:val="VariableTok"/>
     <w:basedOn w:val="VerbatimChar"/>
     <w:rPr>
-      <w:color w:val="19177c"/>
+      <w:rFonts w:ascii="Consolas" w:hAnsi="Consolas"/>
+      <w:color w:val="19177C"/>
+      <w:sz w:val="22"/>
     </w:rPr>
   </w:style>
   <w:style w:type="character" w:customStyle="1" w:styleId="ControlFlowTok">
     <w:name w:val="ControlFlowTok"/>
     <w:basedOn w:val="VerbatimChar"/>
     <w:rPr>
+      <w:rFonts w:ascii="Consolas" w:hAnsi="Consolas"/>
       <w:b/>
       <w:color w:val="007020"/>
+      <w:sz w:val="22"/>
     </w:rPr>
   </w:style>
   <w:style w:type="character" w:customStyle="1" w:styleId="OperatorTok">
     <w:name w:val="OperatorTok"/>
     <w:basedOn w:val="VerbatimChar"/>
     <w:rPr>
+      <w:rFonts w:ascii="Consolas" w:hAnsi="Consolas"/>
       <w:color w:val="666666"/>
+      <w:sz w:val="22"/>
     </w:rPr>
   </w:style>
   <w:style w:type="character" w:customStyle="1" w:styleId="BuiltInTok">
     <w:name w:val="BuiltInTok"/>
     <w:basedOn w:val="VerbatimChar"/>
     <w:rPr>
+      <w:rFonts w:ascii="Consolas" w:hAnsi="Consolas"/>
       <w:color w:val="008000"/>
+      <w:sz w:val="22"/>
     </w:rPr>
   </w:style>
   <w:style w:type="character" w:customStyle="1" w:styleId="ExtensionTok">
     <w:name w:val="ExtensionTok"/>
     <w:basedOn w:val="VerbatimChar"/>
-    <w:rPr/>
+    <w:rPr>
+      <w:rFonts w:ascii="Consolas" w:hAnsi="Consolas"/>
+      <w:sz w:val="22"/>
+    </w:rPr>
   </w:style>
   <w:style w:type="character" w:customStyle="1" w:styleId="PreprocessorTok">
     <w:name w:val="PreprocessorTok"/>
     <w:basedOn w:val="VerbatimChar"/>
     <w:rPr>
-      <w:color w:val="bc7a00"/>
+      <w:rFonts w:ascii="Consolas" w:hAnsi="Consolas"/>
+      <w:color w:val="BC7A00"/>
+      <w:sz w:val="22"/>
     </w:rPr>
   </w:style>
   <w:style w:type="character" w:customStyle="1" w:styleId="AttributeTok">
     <w:name w:val="AttributeTok"/>
     <w:basedOn w:val="VerbatimChar"/>
     <w:rPr>
-      <w:color w:val="7d9029"/>
+      <w:rFonts w:ascii="Consolas" w:hAnsi="Consolas"/>
+      <w:color w:val="7D9029"/>
+      <w:sz w:val="22"/>
     </w:rPr>
   </w:style>
   <w:style w:type="character" w:customStyle="1" w:styleId="RegionMarkerTok">
     <w:name w:val="RegionMarkerTok"/>
     <w:basedOn w:val="VerbatimChar"/>
-    <w:rPr/>
+    <w:rPr>
+      <w:rFonts w:ascii="Consolas" w:hAnsi="Consolas"/>
+      <w:sz w:val="22"/>
+    </w:rPr>
   </w:style>
   <w:style w:type="character" w:customStyle="1" w:styleId="InformationTok">
     <w:name w:val="InformationTok"/>
     <w:basedOn w:val="VerbatimChar"/>
     <w:rPr>
+      <w:rFonts w:ascii="Consolas" w:hAnsi="Consolas"/>
       <w:b/>
       <w:i/>
-      <w:color w:val="60a0b0"/>
+      <w:color w:val="60A0B0"/>
+      <w:sz w:val="22"/>
     </w:rPr>
   </w:style>
   <w:style w:type="character" w:customStyle="1" w:styleId="WarningTok">
     <w:name w:val="WarningTok"/>
     <w:basedOn w:val="VerbatimChar"/>
     <w:rPr>
+      <w:rFonts w:ascii="Consolas" w:hAnsi="Consolas"/>
       <w:b/>
       <w:i/>
-      <w:color w:val="60a0b0"/>
+      <w:color w:val="60A0B0"/>
+      <w:sz w:val="22"/>
     </w:rPr>
   </w:style>
   <w:style w:type="character" w:customStyle="1" w:styleId="AlertTok">
     <w:name w:val="AlertTok"/>
     <w:basedOn w:val="VerbatimChar"/>
     <w:rPr>
+      <w:rFonts w:ascii="Consolas" w:hAnsi="Consolas"/>
       <w:b/>
-      <w:color w:val="ff0000"/>
+      <w:color w:val="FF0000"/>
+      <w:sz w:val="22"/>
     </w:rPr>
   </w:style>
   <w:style w:type="character" w:customStyle="1" w:styleId="ErrorTok">
     <w:name w:val="ErrorTok"/>
     <w:basedOn w:val="VerbatimChar"/>
     <w:rPr>
+      <w:rFonts w:ascii="Consolas" w:hAnsi="Consolas"/>
       <w:b/>
-      <w:color w:val="ff0000"/>
+      <w:color w:val="FF0000"/>
+      <w:sz w:val="22"/>
     </w:rPr>
   </w:style>
   <w:style w:type="character" w:customStyle="1" w:styleId="NormalTok">
     <w:name w:val="NormalTok"/>
     <w:basedOn w:val="VerbatimChar"/>
-    <w:rPr/>
+    <w:rPr>
+      <w:rFonts w:ascii="Consolas" w:hAnsi="Consolas"/>
+      <w:sz w:val="22"/>
+    </w:rPr>
   </w:style>
 </w:styles>
 </file>

</xml_diff>